<commit_message>
+ comments of Jürgen H.
</commit_message>
<xml_diff>
--- a/response_CT_WFW.docx
+++ b/response_CT_WFW.docx
@@ -1812,85 +1812,991 @@
         <w:t>)</w:t>
       </w:r>
       <w:r>
-        <w:t xml:space="preserve"> as well as the reduction due </w:t>
+        <w:t xml:space="preserve"> as well as the reduction due to the off-center electron detection. The latter is unavoidable for darkfield imaging and </w:t>
+      </w:r>
+      <w:r>
+        <w:t>deteriorates th</w:t>
+      </w:r>
+      <w:r>
+        <w:t xml:space="preserve">e resolution by a factor </w:t>
+      </w:r>
+      <w:proofErr w:type="gramStart"/>
+      <w:r>
+        <w:t>between three to nine</w:t>
+      </w:r>
+      <w:r>
+        <w:t xml:space="preserve">, </w:t>
+      </w:r>
+      <w:r>
+        <w:t>depending on the angular photoelectron distribution</w:t>
+      </w:r>
+      <w:proofErr w:type="gramEnd"/>
+      <w:r>
+        <w:t xml:space="preserve">. </w:t>
+      </w:r>
+      <w:r>
+        <w:t xml:space="preserve"> </w:t>
+      </w:r>
+      <w:r>
+        <w:t xml:space="preserve">The information above </w:t>
+      </w:r>
+      <w:proofErr w:type="gramStart"/>
+      <w:r>
+        <w:t>is now added</w:t>
+      </w:r>
+      <w:proofErr w:type="gramEnd"/>
+      <w:r>
+        <w:t xml:space="preserve"> in the </w:t>
+      </w:r>
+      <w:r>
+        <w:t xml:space="preserve">last discussion paragraph of the </w:t>
+      </w:r>
+      <w:r>
+        <w:t>manuscript.</w:t>
+      </w:r>
+      <w:r>
+        <w:t xml:space="preserve"> </w:t>
+      </w:r>
+    </w:p>
+    <w:p>
+      <w:pPr>
+        <w:kinsoku w:val="0"/>
+        <w:overflowPunct w:val="0"/>
+        <w:spacing w:line="360" w:lineRule="auto"/>
+        <w:jc w:val="both"/>
+      </w:pPr>
+    </w:p>
+    <w:p>
+      <w:pPr>
+        <w:kinsoku w:val="0"/>
+        <w:overflowPunct w:val="0"/>
+        <w:spacing w:line="360" w:lineRule="auto"/>
+        <w:jc w:val="both"/>
+      </w:pPr>
+      <w:r>
+        <w:t xml:space="preserve">The magneto optical Kerr effect (MOKE) </w:t>
+      </w:r>
+      <w:proofErr w:type="gramStart"/>
+      <w:r>
+        <w:t>can be implemented</w:t>
+      </w:r>
+      <w:proofErr w:type="gramEnd"/>
+      <w:r>
+        <w:t xml:space="preserve"> with standard optical microscopy</w:t>
+      </w:r>
+      <w:r>
+        <w:t>, and its ultimate spatial resolution can reach 10</w:t>
+      </w:r>
+      <w:r>
+        <w:rPr>
+          <w:rFonts w:ascii="Times New Roman" w:hAnsi="Times New Roman" w:cs="Times New Roman"/>
+        </w:rPr>
+        <w:t> </w:t>
+      </w:r>
+      <w:r>
+        <w:t>nm in combination with near-field optics (</w:t>
+      </w:r>
+      <w:r>
+        <w:t xml:space="preserve">Rev. Sci. </w:t>
+      </w:r>
+      <w:proofErr w:type="spellStart"/>
+      <w:r>
+        <w:lastRenderedPageBreak/>
+        <w:t>Instrum</w:t>
+      </w:r>
+      <w:proofErr w:type="spellEnd"/>
+      <w:r>
+        <w:t xml:space="preserve">. </w:t>
+      </w:r>
+      <w:r>
+        <w:rPr>
+          <w:b/>
+          <w:bCs/>
+        </w:rPr>
+        <w:t>67</w:t>
+      </w:r>
+      <w:r>
+        <w:t>, 715</w:t>
+      </w:r>
+      <w:r>
+        <w:t xml:space="preserve"> </w:t>
+      </w:r>
+      <w:r>
+        <w:t>(1996)</w:t>
+      </w:r>
+      <w:r>
+        <w:t xml:space="preserve">). For </w:t>
+      </w:r>
+      <w:r>
+        <w:t xml:space="preserve">the </w:t>
+      </w:r>
+      <w:r>
+        <w:t>time-resolved</w:t>
+      </w:r>
+      <w:r>
+        <w:t xml:space="preserve"> magnetic</w:t>
+      </w:r>
+      <w:r>
+        <w:t xml:space="preserve"> imaging in combination with ultrafast lasers, a spatial resolution of about </w:t>
+      </w:r>
+      <w:r>
+        <w:t>several</w:t>
+      </w:r>
+      <w:r>
+        <w:t xml:space="preserve"> hundreds of nanometers has been demonstrated as given by the diffraction limit and the wavelength of the femtosecond laser (</w:t>
+      </w:r>
+      <w:r>
+        <w:t xml:space="preserve">Rev. Sci. </w:t>
+      </w:r>
+      <w:proofErr w:type="spellStart"/>
+      <w:r>
+        <w:t>Instrum</w:t>
+      </w:r>
+      <w:proofErr w:type="spellEnd"/>
+      <w:r>
+        <w:t xml:space="preserve">. </w:t>
+      </w:r>
+      <w:r>
+        <w:rPr>
+          <w:b/>
+          <w:bCs/>
+        </w:rPr>
+        <w:t>88</w:t>
+      </w:r>
+      <w:r>
+        <w:t>, 123708 (2017)</w:t>
+      </w:r>
+      <w:r>
+        <w:t>).</w:t>
+      </w:r>
+      <w:r>
+        <w:t xml:space="preserve"> However, the MOKE usually leads to a rotation of the light polarization much smaller than 1</w:t>
+      </w:r>
+      <w:r>
+        <w:rPr>
+          <w:rFonts w:ascii="Times New Roman" w:hAnsi="Times New Roman" w:cs="Times New Roman"/>
+        </w:rPr>
+        <w:t>°</w:t>
+      </w:r>
+      <w:r>
+        <w:t xml:space="preserve"> with a corresponding magnetic signal of less than 1</w:t>
+      </w:r>
+      <w:r>
+        <w:rPr>
+          <w:rFonts w:ascii="Times New Roman" w:hAnsi="Times New Roman" w:cs="Times New Roman"/>
+        </w:rPr>
+        <w:t> </w:t>
+      </w:r>
+      <w:r>
+        <w:t xml:space="preserve">% unless a peculiar electronic structure </w:t>
+      </w:r>
+      <w:r>
+        <w:t>or the nonlinear optical effect is</w:t>
+      </w:r>
+      <w:r>
+        <w:t xml:space="preserve"> involved (</w:t>
+      </w:r>
+      <w:r>
+        <w:t>Nat</w:t>
+      </w:r>
+      <w:r>
+        <w:t>.</w:t>
+      </w:r>
+      <w:r>
+        <w:t xml:space="preserve"> </w:t>
+      </w:r>
+      <w:proofErr w:type="spellStart"/>
+      <w:r>
+        <w:t>Commun</w:t>
+      </w:r>
+      <w:proofErr w:type="spellEnd"/>
+      <w:r>
+        <w:t>.</w:t>
+      </w:r>
+      <w:r>
+        <w:rPr>
+          <w:b/>
+          <w:bCs/>
+        </w:rPr>
+        <w:t> 11</w:t>
+      </w:r>
+      <w:r>
+        <w:t>, 4619 (2020)</w:t>
+      </w:r>
+      <w:r>
+        <w:t>;</w:t>
+      </w:r>
+      <w:r>
+        <w:t xml:space="preserve"> J. Appl. Phys. </w:t>
+      </w:r>
+      <w:r>
+        <w:rPr>
+          <w:b/>
+          <w:bCs/>
+        </w:rPr>
+        <w:t>79</w:t>
+      </w:r>
+      <w:r>
+        <w:t>, 6181 (1996)</w:t>
+      </w:r>
+      <w:r>
+        <w:t>).</w:t>
+      </w:r>
+      <w:r>
+        <w:t xml:space="preserve"> </w:t>
+      </w:r>
+      <w:proofErr w:type="gramStart"/>
+      <w:r>
+        <w:t>Therefore</w:t>
+      </w:r>
+      <w:proofErr w:type="gramEnd"/>
+      <w:r>
+        <w:t xml:space="preserve"> the</w:t>
+      </w:r>
+      <w:r>
+        <w:t xml:space="preserve"> standard</w:t>
+      </w:r>
+      <w:r>
+        <w:t xml:space="preserve"> MOKE signal </w:t>
+      </w:r>
+      <w:r>
+        <w:t>can be</w:t>
+      </w:r>
+      <w:r>
+        <w:t xml:space="preserve"> much smaller than </w:t>
+      </w:r>
+      <w:r>
+        <w:t>our</w:t>
+      </w:r>
+      <w:r>
+        <w:t xml:space="preserve"> darkfield </w:t>
+      </w:r>
+      <w:r>
+        <w:t xml:space="preserve">magnetic </w:t>
+      </w:r>
+      <w:r>
+        <w:t xml:space="preserve">dichroic signal in </w:t>
+      </w:r>
+      <w:r>
+        <w:t>PEEM</w:t>
+      </w:r>
+      <w:r>
+        <w:t xml:space="preserve">. More importantly, </w:t>
+      </w:r>
+      <w:r>
+        <w:t xml:space="preserve">PEEM has a depth sensitivity of a few nanometers </w:t>
+      </w:r>
+      <w:r>
+        <w:t xml:space="preserve">as </w:t>
+      </w:r>
+      <w:r>
+        <w:t xml:space="preserve">determined by the </w:t>
+      </w:r>
+      <w:r>
+        <w:t>mean-free-path of the photoelectrons, whereas the probing depth of MOKE</w:t>
+      </w:r>
+      <w:r>
+        <w:t xml:space="preserve"> is given by the attenuation length of light that is comparable to its wavelength (</w:t>
+      </w:r>
+      <w:r>
+        <w:t xml:space="preserve">Phys. Rev. B </w:t>
+      </w:r>
+      <w:r>
+        <w:rPr>
+          <w:b/>
+          <w:bCs/>
+        </w:rPr>
+        <w:t>65</w:t>
+      </w:r>
+      <w:r>
+        <w:t>, 144405</w:t>
+      </w:r>
+      <w:r>
+        <w:t xml:space="preserve"> (2002)).</w:t>
+      </w:r>
+    </w:p>
+    <w:p>
+      <w:pPr>
+        <w:kinsoku w:val="0"/>
+        <w:overflowPunct w:val="0"/>
+        <w:spacing w:line="360" w:lineRule="auto"/>
+        <w:jc w:val="both"/>
+      </w:pPr>
+      <w:r>
+        <w:t xml:space="preserve">We added the information on the resolution of the magneto-optical Kerr Effect </w:t>
+      </w:r>
+      <w:r>
+        <w:t>in the introduction of the manuscript.</w:t>
+      </w:r>
+    </w:p>
+    <w:p>
+      <w:pPr>
+        <w:kinsoku w:val="0"/>
+        <w:overflowPunct w:val="0"/>
+        <w:spacing w:line="360" w:lineRule="auto"/>
+        <w:jc w:val="both"/>
+      </w:pPr>
+    </w:p>
+    <w:p>
+      <w:pPr>
+        <w:kinsoku w:val="0"/>
+        <w:overflowPunct w:val="0"/>
+        <w:spacing w:line="360" w:lineRule="auto"/>
+        <w:jc w:val="both"/>
+      </w:pPr>
+      <w:r>
+        <w:rPr>
+          <w:b/>
+          <w:bCs/>
+        </w:rPr>
+        <w:t>(</w:t>
+      </w:r>
+      <w:r>
+        <w:rPr>
+          <w:b/>
+          <w:bCs/>
+        </w:rPr>
+        <w:t>A.</w:t>
+      </w:r>
+      <w:r>
+        <w:rPr>
+          <w:b/>
+          <w:bCs/>
+        </w:rPr>
+        <w:t>6)</w:t>
+      </w:r>
+      <w:r>
+        <w:rPr>
+          <w:b/>
+          <w:bCs/>
+        </w:rPr>
+        <w:t xml:space="preserve"> Reviewer A</w:t>
+      </w:r>
+      <w:proofErr w:type="gramStart"/>
+      <w:r>
+        <w:t>: ”</w:t>
+      </w:r>
+      <w:proofErr w:type="gramEnd"/>
+      <w:r>
+        <w:t>The authors focus on in-plane systems, which is most likely true for</w:t>
+      </w:r>
+      <w:r>
+        <w:t xml:space="preserve"> </w:t>
+      </w:r>
+      <w:r>
+        <w:t>their thin film, but the community is currently excited about</w:t>
+      </w:r>
+      <w:r>
+        <w:t xml:space="preserve"> </w:t>
+      </w:r>
+      <w:r>
+        <w:t>orientations that are neither fully</w:t>
+      </w:r>
+      <w:r>
+        <w:t xml:space="preserve"> </w:t>
+      </w:r>
+      <w:r>
+        <w:t>in-plane nor out-of-plane. Can</w:t>
+      </w:r>
+      <w:r>
+        <w:t xml:space="preserve"> </w:t>
+      </w:r>
+      <w:r>
+        <w:t xml:space="preserve">this technique distinguish those arrangements, </w:t>
+      </w:r>
+      <w:r>
+        <w:rPr>
+          <w:i/>
+          <w:iCs/>
+        </w:rPr>
+        <w:t>e.g</w:t>
+      </w:r>
+      <w:r>
+        <w:t>. by varying the</w:t>
+      </w:r>
+      <w:r>
+        <w:t xml:space="preserve"> </w:t>
+      </w:r>
+      <w:r>
+        <w:t>geometry?</w:t>
+      </w:r>
+      <w:r>
+        <w:t>”</w:t>
+      </w:r>
+    </w:p>
+    <w:p>
+      <w:pPr>
+        <w:kinsoku w:val="0"/>
+        <w:overflowPunct w:val="0"/>
+        <w:spacing w:line="360" w:lineRule="auto"/>
+        <w:jc w:val="both"/>
+      </w:pPr>
+    </w:p>
+    <w:p>
+      <w:pPr>
+        <w:kinsoku w:val="0"/>
+        <w:overflowPunct w:val="0"/>
+        <w:spacing w:line="360" w:lineRule="auto"/>
+        <w:jc w:val="both"/>
+      </w:pPr>
+      <w:r>
+        <w:rPr>
+          <w:b/>
+          <w:bCs/>
+        </w:rPr>
+        <w:t>Reply</w:t>
+      </w:r>
+      <w:r>
+        <w:t xml:space="preserve">: </w:t>
+      </w:r>
+      <w:r>
+        <w:t xml:space="preserve">As demonstrated in our manuscript in detail, all the possible in-plane domain orientations </w:t>
+      </w:r>
+      <w:proofErr w:type="gramStart"/>
+      <w:r>
+        <w:t>can be fully resolved</w:t>
+      </w:r>
+      <w:proofErr w:type="gramEnd"/>
+      <w:r>
+        <w:t xml:space="preserve"> by exactly the same number of possible momentum selections at the back focal plane (Fig. 4). In addition, </w:t>
+      </w:r>
+      <w:r>
+        <w:t xml:space="preserve">symmetric </w:t>
+      </w:r>
+      <w:r>
+        <w:t>momentum selection around normal emission is sensitive to the out-of-pla</w:t>
+      </w:r>
+      <w:r>
+        <w:t xml:space="preserve">ne orientation of </w:t>
+      </w:r>
+      <w:r>
+        <w:t xml:space="preserve">the </w:t>
+      </w:r>
+      <w:r>
+        <w:t xml:space="preserve">magnetization as e.g. shown in Phys. Rev. Lett. 96, 237402 (2006). </w:t>
+      </w:r>
+      <w:r>
+        <w:t>Therefore, one is able to address all three different magnetization axes. However, the full 3D reconstruction of the local magnetization direction is beyond the present work</w:t>
+      </w:r>
+      <w:r>
+        <w:t>.</w:t>
+      </w:r>
+    </w:p>
+    <w:p>
+      <w:pPr>
+        <w:kinsoku w:val="0"/>
+        <w:overflowPunct w:val="0"/>
+        <w:spacing w:line="360" w:lineRule="auto"/>
+        <w:jc w:val="both"/>
+      </w:pPr>
+      <w:r>
+        <w:t xml:space="preserve">For more delicate local non-collinear magnetization orientations such as vortex structures, further experimental degrees of freedom will be required to disentangle these orientations. Such additional degrees of freedom, for example, can include the polarization state of light, the spatial phase structure of the light </w:t>
+      </w:r>
+      <w:proofErr w:type="gramStart"/>
+      <w:r>
+        <w:t>wave-front</w:t>
+      </w:r>
+      <w:proofErr w:type="gramEnd"/>
+      <w:r>
+        <w:t xml:space="preserve">, the time delay between successive light pulses, as well as the sample orientation. More specifically, the complementary combination of magnetic dichroic signals with linearly and circularly polarized light (Adv. Electron. Mater. 8, 2200162 (2022)), the orbital angular momentum of light </w:t>
+      </w:r>
+      <w:proofErr w:type="gramStart"/>
+      <w:r>
+        <w:t>wave-front</w:t>
+      </w:r>
+      <w:proofErr w:type="gramEnd"/>
+      <w:r>
+        <w:t xml:space="preserve"> (Phys. Rev. B 107, L060407 (2023)), the time-dependent interference in the nonlinear photoemission processes (Phys. Rev. Research 6, 013163 (2024)), as well as the consecutive measurements with sample rotation (J. Synchrotron </w:t>
+      </w:r>
+      <w:r>
+        <w:lastRenderedPageBreak/>
+        <w:t>Rad. 31, 336 (2024)) have been demonstrated to image the more delicate local non-collinear magnetization orientations.</w:t>
+      </w:r>
+    </w:p>
+    <w:p>
+      <w:pPr>
+        <w:kinsoku w:val="0"/>
+        <w:overflowPunct w:val="0"/>
+        <w:spacing w:line="360" w:lineRule="auto"/>
+        <w:jc w:val="both"/>
+      </w:pPr>
+    </w:p>
+    <w:p>
+      <w:pPr>
+        <w:kinsoku w:val="0"/>
+        <w:overflowPunct w:val="0"/>
+        <w:spacing w:line="360" w:lineRule="auto"/>
+        <w:jc w:val="both"/>
+      </w:pPr>
+    </w:p>
+    <w:p>
+      <w:pPr>
+        <w:kinsoku w:val="0"/>
+        <w:overflowPunct w:val="0"/>
+        <w:spacing w:line="360" w:lineRule="auto"/>
+        <w:jc w:val="both"/>
+      </w:pPr>
+      <w:r>
+        <w:rPr>
+          <w:b/>
+          <w:bCs/>
+        </w:rPr>
+        <w:t>(</w:t>
+      </w:r>
+      <w:r>
+        <w:rPr>
+          <w:b/>
+          <w:bCs/>
+        </w:rPr>
+        <w:t>A.</w:t>
+      </w:r>
+      <w:r>
+        <w:rPr>
+          <w:b/>
+          <w:bCs/>
+        </w:rPr>
+        <w:t>7)</w:t>
+      </w:r>
+      <w:r>
+        <w:rPr>
+          <w:b/>
+          <w:bCs/>
+        </w:rPr>
+        <w:t xml:space="preserve"> Reviewer A</w:t>
+      </w:r>
+      <w:proofErr w:type="gramStart"/>
+      <w:r>
+        <w:t>: ”</w:t>
+      </w:r>
+      <w:proofErr w:type="gramEnd"/>
+      <w:r>
+        <w:t>Symmetric exchange interaction is the dominant interaction, what</w:t>
+      </w:r>
+      <w:r>
+        <w:t xml:space="preserve"> </w:t>
+      </w:r>
+      <w:r>
+        <w:t>about the antisymmetric exchange interaction (DMI)?</w:t>
+      </w:r>
+      <w:r>
+        <w:t>”</w:t>
+      </w:r>
+    </w:p>
+    <w:p>
+      <w:pPr>
+        <w:kinsoku w:val="0"/>
+        <w:overflowPunct w:val="0"/>
+        <w:spacing w:line="360" w:lineRule="auto"/>
+        <w:jc w:val="both"/>
+      </w:pPr>
+    </w:p>
+    <w:p>
+      <w:pPr>
+        <w:kinsoku w:val="0"/>
+        <w:overflowPunct w:val="0"/>
+        <w:spacing w:line="360" w:lineRule="auto"/>
+        <w:jc w:val="both"/>
+      </w:pPr>
+      <w:r>
+        <w:rPr>
+          <w:b/>
+          <w:bCs/>
+        </w:rPr>
+        <w:t>Reply</w:t>
+      </w:r>
+      <w:r>
+        <w:t>:</w:t>
+      </w:r>
+      <w:r>
+        <w:t xml:space="preserve"> The magnetic dichroism reported in our manuscript results from the presence of both spin-orbit interaction and exchange interaction in the electronic structure of</w:t>
+      </w:r>
+      <w:r>
+        <w:t xml:space="preserve"> bulk</w:t>
+      </w:r>
+      <w:r>
+        <w:t xml:space="preserve"> Fe. </w:t>
+      </w:r>
+      <w:r>
+        <w:t xml:space="preserve">Both of these spin-dependent interactions are also involved in the origin of the </w:t>
+      </w:r>
+      <w:r>
+        <w:t>Dzyaloshinskii</w:t>
+      </w:r>
+      <w:r>
+        <w:t xml:space="preserve">-Moriya interaction (DMI, I. </w:t>
+      </w:r>
+      <w:r>
+        <w:t>Dzyaloshinskii</w:t>
+      </w:r>
+      <w:r>
+        <w:t xml:space="preserve">, </w:t>
+      </w:r>
+      <w:r>
+        <w:t>J</w:t>
+      </w:r>
+      <w:r>
+        <w:t xml:space="preserve">. </w:t>
+      </w:r>
+      <w:r>
+        <w:t>Phys</w:t>
+      </w:r>
+      <w:r>
+        <w:t>.</w:t>
+      </w:r>
+      <w:r>
+        <w:t xml:space="preserve"> Chem</w:t>
+      </w:r>
+      <w:r>
+        <w:t>.</w:t>
+      </w:r>
+      <w:r>
+        <w:t xml:space="preserve"> Sol</w:t>
+      </w:r>
+      <w:r>
+        <w:t>.</w:t>
+      </w:r>
+      <w:r>
+        <w:t xml:space="preserve"> </w:t>
+      </w:r>
+      <w:r>
+        <w:rPr>
+          <w:b/>
+          <w:bCs/>
+        </w:rPr>
+        <w:t>4</w:t>
+      </w:r>
+      <w:r>
+        <w:t>,</w:t>
+      </w:r>
+      <w:r>
+        <w:t xml:space="preserve"> 241</w:t>
+      </w:r>
+      <w:r>
+        <w:t xml:space="preserve"> </w:t>
+      </w:r>
+      <w:r>
+        <w:t>(</w:t>
+      </w:r>
+      <w:r>
+        <w:t>1958</w:t>
+      </w:r>
+      <w:r>
+        <w:t>)</w:t>
+      </w:r>
+      <w:r>
+        <w:t xml:space="preserve">; T. Moriya, </w:t>
+      </w:r>
+      <w:r>
+        <w:t xml:space="preserve">Phys. Rev. </w:t>
+      </w:r>
+      <w:r>
+        <w:rPr>
+          <w:b/>
+          <w:bCs/>
+        </w:rPr>
+        <w:t>120</w:t>
+      </w:r>
+      <w:r>
+        <w:t>, 91</w:t>
+      </w:r>
+      <w:r>
+        <w:t xml:space="preserve"> (1960)). However, as has been nicely formulated by T. Moriya in his publication above, the DMI is a direct extension </w:t>
+      </w:r>
+      <w:r>
+        <w:t>of</w:t>
+      </w:r>
+      <w:r>
+        <w:t xml:space="preserve"> the super-exchange interaction</w:t>
+      </w:r>
+      <w:r>
+        <w:t xml:space="preserve"> </w:t>
+      </w:r>
+      <w:r>
+        <w:t xml:space="preserve">as </w:t>
+      </w:r>
+      <w:r>
+        <w:t>modelled by P. W. Anderson</w:t>
+      </w:r>
+      <w:r>
+        <w:t xml:space="preserve">, which </w:t>
+      </w:r>
+      <w:r>
+        <w:t xml:space="preserve">mainly </w:t>
+      </w:r>
+      <w:r>
+        <w:t>describes antiferromagnetic transition metal compounds with low electrical conductivity</w:t>
+      </w:r>
+      <w:r>
+        <w:t xml:space="preserve"> (</w:t>
+      </w:r>
+      <w:r>
+        <w:t xml:space="preserve">Phys. Rev. </w:t>
+      </w:r>
+      <w:r>
+        <w:rPr>
+          <w:b/>
+          <w:bCs/>
+        </w:rPr>
+        <w:t>115</w:t>
+      </w:r>
+      <w:r>
+        <w:t>, 2</w:t>
+      </w:r>
+      <w:r>
+        <w:t xml:space="preserve"> (1959))</w:t>
+      </w:r>
+      <w:r>
+        <w:t>.</w:t>
+      </w:r>
+      <w:r>
+        <w:t xml:space="preserve"> Despite that the DMI would hardly be applicable for the</w:t>
+      </w:r>
+      <w:r>
+        <w:t xml:space="preserve"> bulk Fe in our manuscript, it </w:t>
+      </w:r>
+      <w:r>
+        <w:t>c</w:t>
+      </w:r>
+      <w:r>
+        <w:t xml:space="preserve">ould be important for ultrathin Fe films </w:t>
+      </w:r>
+      <w:r>
+        <w:t xml:space="preserve">grown </w:t>
+      </w:r>
+      <w:r>
+        <w:t>on heavy metal substrate</w:t>
+      </w:r>
+      <w:r>
+        <w:t>s</w:t>
+      </w:r>
+      <w:r>
+        <w:t xml:space="preserve"> (</w:t>
+      </w:r>
+      <w:r>
+        <w:t xml:space="preserve">Phys. Rev. Lett. </w:t>
+      </w:r>
+      <w:r>
+        <w:rPr>
+          <w:b/>
+          <w:bCs/>
+        </w:rPr>
+        <w:t>104</w:t>
+      </w:r>
+      <w:r>
+        <w:t>, 137203</w:t>
+      </w:r>
+      <w:r>
+        <w:t xml:space="preserve"> (2010)).</w:t>
+      </w:r>
+      <w:r>
+        <w:t xml:space="preserve"> In addition, the DMI in transition metal compounds (</w:t>
+      </w:r>
+      <w:r>
+        <w:t xml:space="preserve">Proc. Phys. Soc. </w:t>
+      </w:r>
+      <w:r>
+        <w:rPr>
+          <w:b/>
+          <w:bCs/>
+        </w:rPr>
+        <w:t>79</w:t>
+      </w:r>
+      <w:r>
+        <w:t>, 394</w:t>
+      </w:r>
+      <w:r>
+        <w:t xml:space="preserve"> (1962)) has been</w:t>
+      </w:r>
+      <w:r>
+        <w:t xml:space="preserve"> previously</w:t>
+      </w:r>
+      <w:r>
+        <w:t xml:space="preserve"> observed by magnetic dichroic PEEM (</w:t>
+      </w:r>
+      <w:r>
+        <w:t xml:space="preserve">Phys. Rev. Lett. </w:t>
+      </w:r>
+      <w:r>
+        <w:rPr>
+          <w:b/>
+          <w:bCs/>
+        </w:rPr>
+        <w:t>106</w:t>
+      </w:r>
+      <w:r>
+        <w:t>, 107201</w:t>
+      </w:r>
+      <w:r>
+        <w:t xml:space="preserve"> (2011)).</w:t>
+      </w:r>
+      <w:r>
+        <w:t xml:space="preserve"> </w:t>
+      </w:r>
+      <w:r>
+        <w:t xml:space="preserve">We would like to add that for the basic analysis, only symmetry considerations </w:t>
+      </w:r>
+      <w:proofErr w:type="gramStart"/>
+      <w:r>
+        <w:t>are needed</w:t>
+      </w:r>
+      <w:proofErr w:type="gramEnd"/>
+      <w:r>
+        <w:t>, the origin of the magnetic texture - Heisenberg interaction or DMI - is irrelevant.</w:t>
       </w:r>
       <w:bookmarkStart w:id="0" w:name="_GoBack"/>
       <w:bookmarkEnd w:id="0"/>
-      <w:r>
-        <w:t xml:space="preserve">to the off-center electron detection. The latter is unavoidable for darkfield imaging and </w:t>
-      </w:r>
-      <w:r>
-        <w:t>deteriorates th</w:t>
-      </w:r>
-      <w:r>
-        <w:t xml:space="preserve">e resolution by a factor </w:t>
+    </w:p>
+    <w:p>
+      <w:pPr>
+        <w:kinsoku w:val="0"/>
+        <w:overflowPunct w:val="0"/>
+        <w:spacing w:line="360" w:lineRule="auto"/>
+        <w:jc w:val="both"/>
+      </w:pPr>
+    </w:p>
+    <w:p>
+      <w:pPr>
+        <w:kinsoku w:val="0"/>
+        <w:overflowPunct w:val="0"/>
+        <w:spacing w:line="360" w:lineRule="auto"/>
+        <w:jc w:val="both"/>
+      </w:pPr>
+    </w:p>
+    <w:p>
+      <w:pPr>
+        <w:kinsoku w:val="0"/>
+        <w:overflowPunct w:val="0"/>
+        <w:spacing w:line="360" w:lineRule="auto"/>
+        <w:jc w:val="both"/>
+      </w:pPr>
+      <w:r>
+        <w:rPr>
+          <w:b/>
+          <w:bCs/>
+        </w:rPr>
+        <w:t>(</w:t>
+      </w:r>
+      <w:r>
+        <w:rPr>
+          <w:b/>
+          <w:bCs/>
+        </w:rPr>
+        <w:t>A.</w:t>
+      </w:r>
+      <w:r>
+        <w:rPr>
+          <w:b/>
+          <w:bCs/>
+        </w:rPr>
+        <w:t>8)</w:t>
+      </w:r>
+      <w:r>
+        <w:rPr>
+          <w:b/>
+          <w:bCs/>
+        </w:rPr>
+        <w:t xml:space="preserve"> Reviewer A</w:t>
       </w:r>
       <w:proofErr w:type="gramStart"/>
       <w:r>
-        <w:t>between three to nine</w:t>
-      </w:r>
-      <w:r>
-        <w:t xml:space="preserve">, </w:t>
-      </w:r>
-      <w:r>
-        <w:t>depending on the angular photoelectron distribution</w:t>
+        <w:t>: ”</w:t>
       </w:r>
       <w:proofErr w:type="gramEnd"/>
       <w:r>
-        <w:t xml:space="preserve">. </w:t>
-      </w:r>
-      <w:r>
-        <w:t xml:space="preserve"> </w:t>
-      </w:r>
-      <w:r>
-        <w:t xml:space="preserve">The information above </w:t>
+        <w:t>I am confused about Figs. 2 and 3 when comparing exp</w:t>
+      </w:r>
+      <w:r>
+        <w:t>eriments</w:t>
+      </w:r>
+      <w:r>
+        <w:t xml:space="preserve"> with theory. The</w:t>
+      </w:r>
+      <w:r>
+        <w:t xml:space="preserve"> </w:t>
+      </w:r>
+      <w:r>
+        <w:t>color codes seem to indicate a difference of about a factor 2 (40 vs</w:t>
+      </w:r>
+      <w:r>
+        <w:t xml:space="preserve"> </w:t>
+      </w:r>
+      <w:r>
+        <w:t>20 and 10 vs 6), but why would then the difference between max and min</w:t>
+      </w:r>
+      <w:r>
+        <w:t xml:space="preserve"> </w:t>
+      </w:r>
+      <w:r>
+        <w:t>not be visible in the experimental data? They seem to be much weaker</w:t>
+      </w:r>
+      <w:r>
+        <w:t xml:space="preserve"> </w:t>
+      </w:r>
+      <w:r>
+        <w:t xml:space="preserve">in contrast. Is there a mistake in the display settings? </w:t>
       </w:r>
       <w:proofErr w:type="gramStart"/>
       <w:r>
-        <w:t>is now added</w:t>
+        <w:t>Also</w:t>
       </w:r>
       <w:proofErr w:type="gramEnd"/>
       <w:r>
-        <w:t xml:space="preserve"> in the </w:t>
-      </w:r>
-      <w:r>
-        <w:t xml:space="preserve">last discussion paragraph of the </w:t>
-      </w:r>
-      <w:r>
-        <w:t>manuscript.</w:t>
-      </w:r>
-      <w:r>
-        <w:t xml:space="preserve"> </w:t>
-      </w:r>
-    </w:p>
-    <w:p>
-      <w:pPr>
-        <w:kinsoku w:val="0"/>
-        <w:overflowPunct w:val="0"/>
-        <w:spacing w:line="360" w:lineRule="auto"/>
-        <w:jc w:val="both"/>
-      </w:pPr>
-    </w:p>
-    <w:p>
-      <w:pPr>
-        <w:kinsoku w:val="0"/>
-        <w:overflowPunct w:val="0"/>
-        <w:spacing w:line="360" w:lineRule="auto"/>
-        <w:jc w:val="both"/>
-      </w:pPr>
-      <w:r>
-        <w:t xml:space="preserve">The magneto optical Kerr effect (MOKE) </w:t>
-      </w:r>
-      <w:proofErr w:type="gramStart"/>
-      <w:r>
-        <w:t>can be implemented</w:t>
-      </w:r>
-      <w:proofErr w:type="gramEnd"/>
-      <w:r>
-        <w:t xml:space="preserve"> with standard optical microscopy</w:t>
-      </w:r>
-      <w:r>
-        <w:t>, and its ultimate spatial resolution can reach 10</w:t>
+        <w:t>, why are</w:t>
+      </w:r>
+      <w:r>
+        <w:t xml:space="preserve"> </w:t>
+      </w:r>
+      <w:r>
+        <w:t>the experimental data so noisy? Is this a result of statistics? If so,</w:t>
+      </w:r>
+      <w:r>
+        <w:t xml:space="preserve"> </w:t>
+      </w:r>
+      <w:r>
+        <w:t>why not accumulate better statistics?</w:t>
+      </w:r>
+      <w:r>
+        <w:t>”</w:t>
+      </w:r>
+    </w:p>
+    <w:p>
+      <w:pPr>
+        <w:kinsoku w:val="0"/>
+        <w:overflowPunct w:val="0"/>
+        <w:spacing w:line="360" w:lineRule="auto"/>
+        <w:jc w:val="both"/>
+      </w:pPr>
+    </w:p>
+    <w:p>
+      <w:pPr>
+        <w:kinsoku w:val="0"/>
+        <w:overflowPunct w:val="0"/>
+        <w:spacing w:line="360" w:lineRule="auto"/>
+        <w:jc w:val="both"/>
+      </w:pPr>
+      <w:r>
+        <w:rPr>
+          <w:b/>
+          <w:bCs/>
+        </w:rPr>
+        <w:t>Reply</w:t>
+      </w:r>
+      <w:r>
+        <w:t xml:space="preserve">: We thank the Reviewer for carefully pointing out that there exists a factor of 2 to 3 difference between the absolute values of the dichroic asymmetries </w:t>
+      </w:r>
+      <w:proofErr w:type="spellStart"/>
+      <w:r>
+        <w:t>A</w:t>
+      </w:r>
+      <w:r>
+        <w:rPr>
+          <w:vertAlign w:val="subscript"/>
+        </w:rPr>
+        <w:t>pol</w:t>
+      </w:r>
+      <w:proofErr w:type="spellEnd"/>
+      <w:r>
+        <w:t xml:space="preserve"> (Fig.</w:t>
       </w:r>
       <w:r>
         <w:rPr>
@@ -1899,331 +2805,352 @@
         <w:t> </w:t>
       </w:r>
       <w:r>
-        <w:t>nm in combination with near-field optics (</w:t>
-      </w:r>
-      <w:r>
-        <w:t xml:space="preserve">Rev. Sci. </w:t>
+        <w:t xml:space="preserve">2) and </w:t>
       </w:r>
       <w:proofErr w:type="spellStart"/>
       <w:r>
-        <w:lastRenderedPageBreak/>
-        <w:t>Instrum</w:t>
+        <w:t>A</w:t>
+      </w:r>
+      <w:r>
+        <w:rPr>
+          <w:vertAlign w:val="subscript"/>
+        </w:rPr>
+        <w:t>ex</w:t>
       </w:r>
       <w:proofErr w:type="spellEnd"/>
       <w:r>
-        <w:t xml:space="preserve">. </w:t>
-      </w:r>
-      <w:r>
-        <w:rPr>
-          <w:b/>
-          <w:bCs/>
-        </w:rPr>
-        <w:t>67</w:t>
-      </w:r>
-      <w:r>
-        <w:t>, 715</w:t>
-      </w:r>
-      <w:r>
-        <w:t xml:space="preserve"> </w:t>
-      </w:r>
-      <w:r>
-        <w:t>(1996)</w:t>
-      </w:r>
-      <w:r>
-        <w:t xml:space="preserve">). For </w:t>
-      </w:r>
-      <w:r>
-        <w:t xml:space="preserve">the </w:t>
-      </w:r>
-      <w:r>
-        <w:t>time-resolved</w:t>
-      </w:r>
-      <w:r>
-        <w:t xml:space="preserve"> magnetic</w:t>
-      </w:r>
-      <w:r>
-        <w:t xml:space="preserve"> imaging in combination with ultrafast lasers, a spatial resolution of about </w:t>
-      </w:r>
-      <w:r>
-        <w:t>several</w:t>
-      </w:r>
-      <w:r>
-        <w:t xml:space="preserve"> hundreds of nanometers has been demonstrated as given by the diffraction limit and the wavelength of the femtosecond laser (</w:t>
-      </w:r>
-      <w:r>
-        <w:t xml:space="preserve">Rev. Sci. </w:t>
-      </w:r>
-      <w:proofErr w:type="spellStart"/>
-      <w:r>
-        <w:t>Instrum</w:t>
-      </w:r>
-      <w:proofErr w:type="spellEnd"/>
-      <w:r>
-        <w:t xml:space="preserve">. </w:t>
-      </w:r>
-      <w:r>
-        <w:rPr>
-          <w:b/>
-          <w:bCs/>
-        </w:rPr>
-        <w:t>88</w:t>
-      </w:r>
-      <w:r>
-        <w:t>, 123708 (2017)</w:t>
-      </w:r>
-      <w:r>
-        <w:t>).</w:t>
-      </w:r>
-      <w:r>
-        <w:t xml:space="preserve"> However, the MOKE usually leads to a rotation of the light polarization much smaller than 1</w:t>
+        <w:t xml:space="preserve"> (Fig.</w:t>
       </w:r>
       <w:r>
         <w:rPr>
           <w:rFonts w:ascii="Times New Roman" w:hAnsi="Times New Roman" w:cs="Times New Roman"/>
         </w:rPr>
-        <w:t>°</w:t>
-      </w:r>
-      <w:r>
-        <w:t xml:space="preserve"> with a corresponding magnetic signal of less than 1</w:t>
-      </w:r>
-      <w:r>
-        <w:rPr>
-          <w:rFonts w:ascii="Times New Roman" w:hAnsi="Times New Roman" w:cs="Times New Roman"/>
-        </w:rPr>
         <w:t> </w:t>
       </w:r>
       <w:r>
-        <w:t xml:space="preserve">% unless a peculiar electronic structure </w:t>
-      </w:r>
-      <w:r>
-        <w:t>or the nonlinear optical effect is</w:t>
-      </w:r>
-      <w:r>
-        <w:t xml:space="preserve"> involved (</w:t>
-      </w:r>
-      <w:r>
-        <w:t>Nat</w:t>
+        <w:t>3)</w:t>
+      </w:r>
+      <w:r>
+        <w:t xml:space="preserve"> from the experiments and theory</w:t>
       </w:r>
       <w:r>
         <w:t>.</w:t>
       </w:r>
       <w:r>
-        <w:t xml:space="preserve"> </w:t>
-      </w:r>
-      <w:proofErr w:type="spellStart"/>
-      <w:r>
-        <w:t>Commun</w:t>
-      </w:r>
-      <w:proofErr w:type="spellEnd"/>
-      <w:r>
-        <w:t>.</w:t>
-      </w:r>
-      <w:r>
-        <w:rPr>
-          <w:b/>
-          <w:bCs/>
-        </w:rPr>
-        <w:t> 11</w:t>
-      </w:r>
-      <w:r>
-        <w:t>, 4619 (2020)</w:t>
-      </w:r>
-      <w:r>
-        <w:t>;</w:t>
-      </w:r>
-      <w:r>
-        <w:t xml:space="preserve"> J. Appl. Phys. </w:t>
-      </w:r>
-      <w:r>
-        <w:rPr>
-          <w:b/>
-          <w:bCs/>
-        </w:rPr>
-        <w:t>79</w:t>
-      </w:r>
-      <w:r>
-        <w:t>, 6181 (1996)</w:t>
-      </w:r>
-      <w:r>
-        <w:t>).</w:t>
-      </w:r>
-      <w:r>
-        <w:t xml:space="preserve"> </w:t>
-      </w:r>
-      <w:proofErr w:type="gramStart"/>
-      <w:r>
-        <w:t>Therefore</w:t>
-      </w:r>
-      <w:proofErr w:type="gramEnd"/>
-      <w:r>
-        <w:t xml:space="preserve"> the</w:t>
-      </w:r>
-      <w:r>
-        <w:t xml:space="preserve"> standard</w:t>
-      </w:r>
-      <w:r>
-        <w:t xml:space="preserve"> MOKE signal </w:t>
-      </w:r>
-      <w:r>
-        <w:t>can be</w:t>
-      </w:r>
-      <w:r>
-        <w:t xml:space="preserve"> much smaller than </w:t>
-      </w:r>
-      <w:r>
-        <w:t>our</w:t>
-      </w:r>
-      <w:r>
-        <w:t xml:space="preserve"> darkfield </w:t>
-      </w:r>
-      <w:r>
-        <w:t xml:space="preserve">magnetic </w:t>
-      </w:r>
-      <w:r>
-        <w:t xml:space="preserve">dichroic signal in </w:t>
-      </w:r>
-      <w:r>
-        <w:t>PEEM</w:t>
-      </w:r>
-      <w:r>
-        <w:t xml:space="preserve">. More importantly, </w:t>
-      </w:r>
-      <w:r>
-        <w:t xml:space="preserve">PEEM has a depth sensitivity of a few nanometers </w:t>
-      </w:r>
-      <w:r>
-        <w:t xml:space="preserve">as </w:t>
-      </w:r>
-      <w:r>
-        <w:t xml:space="preserve">determined by the </w:t>
-      </w:r>
-      <w:r>
-        <w:t>mean-free-path of the photoelectrons, whereas the probing depth of MOKE</w:t>
-      </w:r>
-      <w:r>
-        <w:t xml:space="preserve"> is given by the attenuation length of light that is comparable to its wavelength (</w:t>
-      </w:r>
-      <w:r>
-        <w:t xml:space="preserve">Phys. Rev. B </w:t>
-      </w:r>
-      <w:r>
-        <w:rPr>
-          <w:b/>
-          <w:bCs/>
-        </w:rPr>
-        <w:t>65</w:t>
-      </w:r>
-      <w:r>
-        <w:t>, 144405</w:t>
-      </w:r>
-      <w:r>
-        <w:t xml:space="preserve"> (2002)).</w:t>
-      </w:r>
-    </w:p>
-    <w:p>
-      <w:pPr>
-        <w:kinsoku w:val="0"/>
-        <w:overflowPunct w:val="0"/>
-        <w:spacing w:line="360" w:lineRule="auto"/>
-        <w:jc w:val="both"/>
-      </w:pPr>
-      <w:r>
-        <w:t xml:space="preserve">We added the information on the resolution of the magneto-optical Kerr Effect </w:t>
-      </w:r>
-      <w:r>
-        <w:t>in the introduction of the manuscript.</w:t>
-      </w:r>
-    </w:p>
-    <w:p>
-      <w:pPr>
-        <w:kinsoku w:val="0"/>
-        <w:overflowPunct w:val="0"/>
-        <w:spacing w:line="360" w:lineRule="auto"/>
-        <w:jc w:val="both"/>
-      </w:pPr>
-    </w:p>
-    <w:p>
-      <w:pPr>
-        <w:kinsoku w:val="0"/>
-        <w:overflowPunct w:val="0"/>
-        <w:spacing w:line="360" w:lineRule="auto"/>
-        <w:jc w:val="both"/>
-      </w:pPr>
-      <w:r>
-        <w:rPr>
-          <w:b/>
-          <w:bCs/>
-        </w:rPr>
-        <w:t>(</w:t>
-      </w:r>
-      <w:r>
-        <w:rPr>
-          <w:b/>
-          <w:bCs/>
-        </w:rPr>
-        <w:t>A.</w:t>
-      </w:r>
-      <w:r>
-        <w:rPr>
-          <w:b/>
-          <w:bCs/>
-        </w:rPr>
-        <w:t>6)</w:t>
-      </w:r>
-      <w:r>
-        <w:rPr>
-          <w:b/>
-          <w:bCs/>
-        </w:rPr>
-        <w:t xml:space="preserve"> Reviewer A</w:t>
-      </w:r>
-      <w:proofErr w:type="gramStart"/>
-      <w:r>
-        <w:t>: ”</w:t>
-      </w:r>
-      <w:proofErr w:type="gramEnd"/>
-      <w:r>
-        <w:t>The authors focus on in-plane systems, which is most likely true for</w:t>
-      </w:r>
-      <w:r>
-        <w:t xml:space="preserve"> </w:t>
-      </w:r>
-      <w:r>
-        <w:t>their thin film, but the community is currently excited about</w:t>
-      </w:r>
-      <w:r>
-        <w:t xml:space="preserve"> </w:t>
-      </w:r>
-      <w:r>
-        <w:t>orientations that are neither fully</w:t>
-      </w:r>
-      <w:r>
-        <w:t xml:space="preserve"> </w:t>
-      </w:r>
-      <w:r>
-        <w:t>in-plane nor out-of-plane. Can</w:t>
-      </w:r>
-      <w:r>
-        <w:t xml:space="preserve"> </w:t>
-      </w:r>
-      <w:r>
-        <w:t xml:space="preserve">this technique distinguish those arrangements, </w:t>
+        <w:t xml:space="preserve"> In our </w:t>
+      </w:r>
+      <w:r>
+        <w:t>calculations,</w:t>
+      </w:r>
+      <w:r>
+        <w:t xml:space="preserve"> we did not use any</w:t>
+      </w:r>
+      <w:r>
+        <w:t xml:space="preserve"> specific</w:t>
+      </w:r>
+      <w:r>
+        <w:t xml:space="preserve"> </w:t>
       </w:r>
       <w:r>
         <w:rPr>
           <w:i/>
           <w:iCs/>
         </w:rPr>
-        <w:t>e.g</w:t>
-      </w:r>
-      <w:r>
-        <w:t>. by varying the</w:t>
-      </w:r>
-      <w:r>
-        <w:t xml:space="preserve"> </w:t>
-      </w:r>
-      <w:r>
-        <w:t>geometry?</w:t>
+        <w:t>ad hoc</w:t>
+      </w:r>
+      <w:r>
+        <w:t xml:space="preserve"> parameters in order to remove this discrepancy between the experiments and theory.</w:t>
+      </w:r>
+      <w:r>
+        <w:t xml:space="preserve"> </w:t>
+      </w:r>
+      <w:r>
+        <w:lastRenderedPageBreak/>
+        <w:t>Furthermore, for</w:t>
+      </w:r>
+      <w:r>
+        <w:t xml:space="preserve"> our experimental data in these figures, the difference between the maximum </w:t>
+      </w:r>
+      <w:r>
+        <w:t xml:space="preserve">and </w:t>
+      </w:r>
+      <w:r>
+        <w:t xml:space="preserve">minimum </w:t>
+      </w:r>
+      <w:r>
+        <w:t>in</w:t>
+      </w:r>
+      <w:r>
+        <w:t xml:space="preserve"> the </w:t>
+      </w:r>
+      <w:proofErr w:type="spellStart"/>
+      <w:r>
+        <w:t>A</w:t>
+      </w:r>
+      <w:r>
+        <w:rPr>
+          <w:vertAlign w:val="subscript"/>
+        </w:rPr>
+        <w:t>pol</w:t>
+      </w:r>
+      <w:proofErr w:type="spellEnd"/>
+      <w:r>
+        <w:t xml:space="preserve"> and </w:t>
+      </w:r>
+      <w:proofErr w:type="spellStart"/>
+      <w:r>
+        <w:t>A</w:t>
+      </w:r>
+      <w:r>
+        <w:rPr>
+          <w:vertAlign w:val="subscript"/>
+        </w:rPr>
+        <w:t>ex</w:t>
+      </w:r>
+      <w:proofErr w:type="spellEnd"/>
+      <w:r>
+        <w:t xml:space="preserve"> </w:t>
+      </w:r>
+      <w:proofErr w:type="gramStart"/>
+      <w:r>
+        <w:t>can be identified</w:t>
+      </w:r>
+      <w:proofErr w:type="gramEnd"/>
+      <w:r>
+        <w:t xml:space="preserve"> by looking at the most intense red </w:t>
+      </w:r>
+      <w:r>
+        <w:t>and blue</w:t>
+      </w:r>
+      <w:r>
+        <w:t xml:space="preserve"> regions</w:t>
+      </w:r>
+      <w:r>
+        <w:t xml:space="preserve"> in the left columns of Fig.</w:t>
+      </w:r>
+      <w:r>
+        <w:rPr>
+          <w:rFonts w:ascii="Times New Roman" w:hAnsi="Times New Roman" w:cs="Times New Roman"/>
+        </w:rPr>
+        <w:t> </w:t>
+      </w:r>
+      <w:r>
+        <w:t>2 and Fig.</w:t>
+      </w:r>
+      <w:r>
+        <w:rPr>
+          <w:rFonts w:ascii="Times New Roman" w:hAnsi="Times New Roman" w:cs="Times New Roman"/>
+        </w:rPr>
+        <w:t> </w:t>
+      </w:r>
+      <w:r>
+        <w:t>3</w:t>
+      </w:r>
+      <w:r>
+        <w:t>.</w:t>
+      </w:r>
+      <w:r>
+        <w:t xml:space="preserve"> For a fair comparison, in these figures we specifically fix</w:t>
+      </w:r>
+      <w:r>
+        <w:t xml:space="preserve"> the range of </w:t>
+      </w:r>
+      <w:proofErr w:type="gramStart"/>
+      <w:r>
+        <w:t>color coding</w:t>
+      </w:r>
+      <w:proofErr w:type="gramEnd"/>
+      <w:r>
+        <w:t>, so that the data at different energies can be directly compared.</w:t>
+      </w:r>
+      <w:r>
+        <w:t xml:space="preserve"> </w:t>
+      </w:r>
+      <w:r>
+        <w:t>Our calculations describe the direct photoemission process but do not include secondary electrons due to scattering events. The latter are always present in experimental data and reduce the absolute value of the dichroic asymmetries</w:t>
+      </w:r>
+      <w:r>
+        <w:t>.</w:t>
+      </w:r>
+    </w:p>
+    <w:p>
+      <w:pPr>
+        <w:kinsoku w:val="0"/>
+        <w:overflowPunct w:val="0"/>
+        <w:spacing w:line="360" w:lineRule="auto"/>
+        <w:jc w:val="both"/>
+      </w:pPr>
+      <w:r>
+        <w:t xml:space="preserve">The fluctuation in our experimental data </w:t>
+      </w:r>
+      <w:r>
+        <w:t xml:space="preserve">mainly </w:t>
+      </w:r>
+      <w:r>
+        <w:t xml:space="preserve">reflects the counting statistics of photoelectrons, which </w:t>
+      </w:r>
+      <w:proofErr w:type="gramStart"/>
+      <w:r>
+        <w:t>c</w:t>
+      </w:r>
+      <w:r>
+        <w:t>ould be reduced</w:t>
+      </w:r>
+      <w:proofErr w:type="gramEnd"/>
+      <w:r>
+        <w:t xml:space="preserve"> </w:t>
+      </w:r>
+      <w:r>
+        <w:t>if</w:t>
+      </w:r>
+      <w:r>
+        <w:t xml:space="preserve"> a</w:t>
+      </w:r>
+      <w:r>
+        <w:t>n order-of-magnitude longer</w:t>
+      </w:r>
+      <w:r>
+        <w:t xml:space="preserve"> measur</w:t>
+      </w:r>
+      <w:r>
+        <w:t>ement time would be applied. However, the improvement of the counting statistics at small binding energies close to the Fermi level (E</w:t>
+      </w:r>
+      <w:r>
+        <w:rPr>
+          <w:vertAlign w:val="subscript"/>
+        </w:rPr>
+        <w:t>F</w:t>
+      </w:r>
+      <w:r>
+        <w:t xml:space="preserve">), such as </w:t>
+      </w:r>
+      <w:proofErr w:type="spellStart"/>
+      <w:r>
+        <w:t>A</w:t>
+      </w:r>
+      <w:r>
+        <w:rPr>
+          <w:vertAlign w:val="subscript"/>
+        </w:rPr>
+        <w:t>ex</w:t>
+      </w:r>
+      <w:proofErr w:type="spellEnd"/>
+      <w:r>
+        <w:t xml:space="preserve"> at 0.05 eV in the top-most left panel of Fig.</w:t>
+      </w:r>
+      <w:r>
+        <w:rPr>
+          <w:rFonts w:ascii="Times New Roman" w:hAnsi="Times New Roman" w:cs="Times New Roman"/>
+        </w:rPr>
+        <w:t> </w:t>
+      </w:r>
+      <w:r>
+        <w:t>3, would still be limited intrinsically by the reduced photoemission intensity close to E</w:t>
+      </w:r>
+      <w:r>
+        <w:rPr>
+          <w:vertAlign w:val="subscript"/>
+        </w:rPr>
+        <w:t>F</w:t>
+      </w:r>
+      <w:r>
+        <w:t>. More importantly, the main physics discussed in our manuscript will still hold</w:t>
+      </w:r>
+      <w:r>
+        <w:t xml:space="preserve"> as supported by the</w:t>
+      </w:r>
+      <w:r>
+        <w:t xml:space="preserve"> reasonable</w:t>
+      </w:r>
+      <w:r>
+        <w:t xml:space="preserve"> qualitative agreement between our experiments and theoretical calculations in Fig.</w:t>
+      </w:r>
+      <w:r>
+        <w:rPr>
+          <w:rFonts w:ascii="Times New Roman" w:hAnsi="Times New Roman" w:cs="Times New Roman"/>
+        </w:rPr>
+        <w:t> </w:t>
+      </w:r>
+      <w:r>
+        <w:t>2 and Fig.</w:t>
+      </w:r>
+      <w:r>
+        <w:rPr>
+          <w:rFonts w:ascii="Times New Roman" w:hAnsi="Times New Roman" w:cs="Times New Roman"/>
+        </w:rPr>
+        <w:t> </w:t>
+      </w:r>
+      <w:r>
+        <w:t>3</w:t>
+      </w:r>
+      <w:r>
+        <w:t>.</w:t>
+      </w:r>
+    </w:p>
+    <w:p>
+      <w:pPr>
+        <w:kinsoku w:val="0"/>
+        <w:overflowPunct w:val="0"/>
+        <w:spacing w:line="360" w:lineRule="auto"/>
+        <w:jc w:val="both"/>
+      </w:pPr>
+    </w:p>
+    <w:p>
+      <w:pPr>
+        <w:kinsoku w:val="0"/>
+        <w:overflowPunct w:val="0"/>
+        <w:spacing w:line="360" w:lineRule="auto"/>
+        <w:jc w:val="both"/>
+      </w:pPr>
+    </w:p>
+    <w:p>
+      <w:pPr>
+        <w:kinsoku w:val="0"/>
+        <w:overflowPunct w:val="0"/>
+        <w:spacing w:line="360" w:lineRule="auto"/>
+        <w:jc w:val="both"/>
+      </w:pPr>
+      <w:r>
+        <w:rPr>
+          <w:b/>
+          <w:bCs/>
+        </w:rPr>
+        <w:t>(</w:t>
+      </w:r>
+      <w:r>
+        <w:rPr>
+          <w:b/>
+          <w:bCs/>
+        </w:rPr>
+        <w:t>A.</w:t>
+      </w:r>
+      <w:r>
+        <w:rPr>
+          <w:b/>
+          <w:bCs/>
+        </w:rPr>
+        <w:t>9)</w:t>
+      </w:r>
+      <w:r>
+        <w:rPr>
+          <w:b/>
+          <w:bCs/>
+        </w:rPr>
+        <w:t xml:space="preserve"> Reviewer A</w:t>
+      </w:r>
+      <w:proofErr w:type="gramStart"/>
+      <w:r>
+        <w:t>: ”</w:t>
+      </w:r>
+      <w:proofErr w:type="gramEnd"/>
+      <w:r>
+        <w:t>Fig. 4 needs a length scale bar and I highly encourage the authors to</w:t>
+      </w:r>
+      <w:r>
+        <w:t xml:space="preserve"> </w:t>
+      </w:r>
+      <w:r>
+        <w:t>discuss spatial resolution.</w:t>
       </w:r>
       <w:r>
         <w:t>”</w:t>
@@ -2252,139 +3179,333 @@
         <w:t>Reply</w:t>
       </w:r>
       <w:r>
+        <w:t>:</w:t>
+      </w:r>
+      <w:r>
+        <w:t xml:space="preserve"> The size of all figures in Fig.</w:t>
+      </w:r>
+      <w:r>
+        <w:rPr>
+          <w:rFonts w:ascii="Times New Roman" w:hAnsi="Times New Roman" w:cs="Times New Roman"/>
+        </w:rPr>
+        <w:t> </w:t>
+      </w:r>
+      <w:r>
+        <w:t>4</w:t>
+      </w:r>
+      <w:r>
+        <w:t xml:space="preserve"> </w:t>
+      </w:r>
+      <w:r>
+        <w:t>is 56</w:t>
+      </w:r>
+      <w:r>
+        <w:rPr>
+          <w:rFonts w:ascii="Times New Roman" w:hAnsi="Times New Roman" w:cs="Times New Roman"/>
+        </w:rPr>
+        <w:t> </w:t>
+      </w:r>
+      <w:proofErr w:type="spellStart"/>
+      <w:r>
+        <w:t>μm</w:t>
+      </w:r>
+      <w:proofErr w:type="spellEnd"/>
+      <w:r>
+        <w:t xml:space="preserve"> x 56</w:t>
+      </w:r>
+      <w:r>
+        <w:rPr>
+          <w:rFonts w:ascii="Times New Roman" w:hAnsi="Times New Roman" w:cs="Times New Roman"/>
+        </w:rPr>
+        <w:t> </w:t>
+      </w:r>
+      <w:proofErr w:type="spellStart"/>
+      <w:r>
+        <w:t>μm</w:t>
+      </w:r>
+      <w:proofErr w:type="spellEnd"/>
+      <w:r>
+        <w:t xml:space="preserve"> as written in </w:t>
+      </w:r>
+      <w:r>
+        <w:t>the</w:t>
+      </w:r>
+      <w:r>
+        <w:t xml:space="preserve"> figure caption, and the spatial resolution is</w:t>
+      </w:r>
+      <w:r>
+        <w:t xml:space="preserve"> address</w:t>
+      </w:r>
+      <w:r>
+        <w:t>ed</w:t>
+      </w:r>
+      <w:r>
+        <w:t xml:space="preserve"> above in </w:t>
+      </w:r>
+      <w:r>
+        <w:rPr>
+          <w:b/>
+          <w:bCs/>
+        </w:rPr>
+        <w:t xml:space="preserve">(A.5) </w:t>
+      </w:r>
+      <w:r>
+        <w:t xml:space="preserve">in </w:t>
+      </w:r>
+      <w:r>
+        <w:t xml:space="preserve">great </w:t>
+      </w:r>
+      <w:r>
+        <w:t>detail</w:t>
+      </w:r>
+      <w:r>
+        <w:t xml:space="preserve"> as well as added in the manuscript.</w:t>
+      </w:r>
+    </w:p>
+    <w:p>
+      <w:pPr>
+        <w:kinsoku w:val="0"/>
+        <w:overflowPunct w:val="0"/>
+        <w:spacing w:line="360" w:lineRule="auto"/>
+        <w:jc w:val="both"/>
+      </w:pPr>
+    </w:p>
+    <w:p>
+      <w:pPr>
+        <w:kinsoku w:val="0"/>
+        <w:overflowPunct w:val="0"/>
+        <w:spacing w:line="360" w:lineRule="auto"/>
+        <w:jc w:val="both"/>
+      </w:pPr>
+    </w:p>
+    <w:p>
+      <w:pPr>
+        <w:kinsoku w:val="0"/>
+        <w:overflowPunct w:val="0"/>
+        <w:spacing w:line="360" w:lineRule="auto"/>
+        <w:jc w:val="both"/>
+      </w:pPr>
+      <w:r>
+        <w:rPr>
+          <w:b/>
+          <w:bCs/>
+        </w:rPr>
+        <w:t>(</w:t>
+      </w:r>
+      <w:r>
+        <w:rPr>
+          <w:b/>
+          <w:bCs/>
+        </w:rPr>
+        <w:t>A.</w:t>
+      </w:r>
+      <w:r>
+        <w:rPr>
+          <w:b/>
+          <w:bCs/>
+        </w:rPr>
+        <w:t>10)</w:t>
+      </w:r>
+      <w:r>
+        <w:rPr>
+          <w:b/>
+          <w:bCs/>
+        </w:rPr>
+        <w:t xml:space="preserve"> Reviewer A</w:t>
+      </w:r>
+      <w:proofErr w:type="gramStart"/>
+      <w:r>
+        <w:t>: ”</w:t>
+      </w:r>
+      <w:proofErr w:type="gramEnd"/>
+      <w:r>
+        <w:t>ARPES in Ref. [25, 28]. Why do the authors only mention their own</w:t>
+      </w:r>
+      <w:r>
+        <w:t xml:space="preserve"> </w:t>
+      </w:r>
+      <w:r>
+        <w:t>work? There are numerous ARPES reviews, which might be better suited.</w:t>
+      </w:r>
+      <w:r>
+        <w:t>”</w:t>
+      </w:r>
+    </w:p>
+    <w:p>
+      <w:pPr>
+        <w:kinsoku w:val="0"/>
+        <w:overflowPunct w:val="0"/>
+        <w:spacing w:line="360" w:lineRule="auto"/>
+        <w:jc w:val="both"/>
+        <w:rPr>
+          <w:b/>
+          <w:bCs/>
+        </w:rPr>
+      </w:pPr>
+    </w:p>
+    <w:p>
+      <w:pPr>
+        <w:kinsoku w:val="0"/>
+        <w:overflowPunct w:val="0"/>
+        <w:spacing w:line="360" w:lineRule="auto"/>
+        <w:jc w:val="both"/>
+      </w:pPr>
+      <w:r>
+        <w:rPr>
+          <w:b/>
+          <w:bCs/>
+        </w:rPr>
+        <w:t>Reply</w:t>
+      </w:r>
+      <w:r>
         <w:t xml:space="preserve">: </w:t>
       </w:r>
       <w:r>
-        <w:t xml:space="preserve">As demonstrated in our manuscript in detail, all the possible in-plane domain orientations </w:t>
+        <w:t xml:space="preserve">We thank the Reviewer for this hint, but in that paragraph of our manuscript we </w:t>
+      </w:r>
+      <w:r>
+        <w:t>are</w:t>
+      </w:r>
+      <w:r>
+        <w:t xml:space="preserve"> only citing our experimental setup (to shorten the manuscript) and d</w:t>
+      </w:r>
+      <w:r>
+        <w:t>o not discuss any ARPES spectra</w:t>
+      </w:r>
+      <w:r>
+        <w:t>.</w:t>
+      </w:r>
+    </w:p>
+    <w:p>
+      <w:pPr>
+        <w:kinsoku w:val="0"/>
+        <w:overflowPunct w:val="0"/>
+        <w:spacing w:line="360" w:lineRule="auto"/>
+        <w:jc w:val="both"/>
+      </w:pPr>
+    </w:p>
+    <w:p>
+      <w:pPr>
+        <w:kinsoku w:val="0"/>
+        <w:overflowPunct w:val="0"/>
+        <w:spacing w:line="360" w:lineRule="auto"/>
+        <w:jc w:val="both"/>
+      </w:pPr>
+      <w:r>
+        <w:rPr>
+          <w:b/>
+          <w:bCs/>
+        </w:rPr>
+        <w:t>(</w:t>
+      </w:r>
+      <w:r>
+        <w:rPr>
+          <w:b/>
+          <w:bCs/>
+        </w:rPr>
+        <w:t>A.</w:t>
+      </w:r>
+      <w:r>
+        <w:rPr>
+          <w:b/>
+          <w:bCs/>
+        </w:rPr>
+        <w:t>11)</w:t>
+      </w:r>
+      <w:r>
+        <w:rPr>
+          <w:b/>
+          <w:bCs/>
+        </w:rPr>
+        <w:t xml:space="preserve"> Reviewer A</w:t>
       </w:r>
       <w:proofErr w:type="gramStart"/>
       <w:r>
-        <w:t>can be fully resolved</w:t>
+        <w:t>: ”</w:t>
       </w:r>
       <w:proofErr w:type="gramEnd"/>
       <w:r>
-        <w:t xml:space="preserve"> by exactly the same number of possible momentum selections at the back focal plane (Fig. 4). In addition, </w:t>
-      </w:r>
-      <w:r>
-        <w:t xml:space="preserve">symmetric </w:t>
-      </w:r>
-      <w:r>
-        <w:t>momentum selection around normal emission is sensitive to the out-of-pla</w:t>
-      </w:r>
-      <w:r>
-        <w:t xml:space="preserve">ne orientation of </w:t>
-      </w:r>
-      <w:r>
-        <w:t xml:space="preserve">the </w:t>
-      </w:r>
-      <w:r>
-        <w:t xml:space="preserve">magnetization as e.g. shown in Phys. Rev. Lett. 96, 237402 (2006). </w:t>
-      </w:r>
-      <w:r>
-        <w:t>Therefore, one is able to address all three different magnetization axes. However, the full 3D reconstruction of the local magnetization direction is beyond the present work</w:t>
+        <w:t>Last sentence: "This capability opens new avenues for studying the</w:t>
+      </w:r>
+      <w:r>
+        <w:t xml:space="preserve"> </w:t>
+      </w:r>
+      <w:r>
+        <w:t>ultrafast motion of domain walls [32] or large skyrmions on nanometer</w:t>
+      </w:r>
+      <w:r>
+        <w:t xml:space="preserve"> </w:t>
+      </w:r>
+      <w:r>
+        <w:t>length scales [33–35]</w:t>
       </w:r>
       <w:r>
         <w:t>.</w:t>
       </w:r>
-    </w:p>
-    <w:p>
-      <w:pPr>
-        <w:kinsoku w:val="0"/>
-        <w:overflowPunct w:val="0"/>
-        <w:spacing w:line="360" w:lineRule="auto"/>
-        <w:jc w:val="both"/>
-      </w:pPr>
-      <w:r>
-        <w:t xml:space="preserve">For more delicate local non-collinear magnetization orientations such as vortex structures, further experimental degrees of freedom will be required to disentangle these orientations. Such additional degrees of freedom, for example, can include the polarization state of light, the spatial phase structure of the light </w:t>
+      <w:r>
+        <w:t>"</w:t>
+      </w:r>
+      <w:r>
+        <w:t xml:space="preserve"> </w:t>
+      </w:r>
+      <w:r>
+        <w:t>I would disagree with those statements. D</w:t>
+      </w:r>
+      <w:r>
+        <w:t>omain wall</w:t>
+      </w:r>
+      <w:r>
+        <w:t>s might not be the most</w:t>
+      </w:r>
+      <w:r>
+        <w:t xml:space="preserve"> </w:t>
+      </w:r>
+      <w:r>
+        <w:t>important objects to study with</w:t>
+      </w:r>
+      <w:r>
+        <w:t xml:space="preserve"> ultrafast</w:t>
+      </w:r>
+      <w:r>
+        <w:t xml:space="preserve"> techniques, particularly, if the</w:t>
+      </w:r>
+      <w:r>
+        <w:t xml:space="preserve"> </w:t>
+      </w:r>
+      <w:r>
+        <w:t xml:space="preserve">microscopy cannot resolve </w:t>
+      </w:r>
+      <w:r>
+        <w:t>domain wall</w:t>
+      </w:r>
+      <w:r>
+        <w:t xml:space="preserve">s at all. </w:t>
+      </w:r>
+      <w:r>
+        <w:lastRenderedPageBreak/>
+        <w:t xml:space="preserve">Second. </w:t>
       </w:r>
       <w:proofErr w:type="gramStart"/>
       <w:r>
-        <w:t>wave-front</w:t>
+        <w:t>what</w:t>
       </w:r>
       <w:proofErr w:type="gramEnd"/>
       <w:r>
-        <w:t xml:space="preserve">, the time delay between successive light pulses, as well as the sample orientation. More specifically, the complementary combination of magnetic dichroic signals with linearly and circularly polarized light (Adv. Electron. Mater. 8, 2200162 (2022)), the orbital angular momentum of light </w:t>
+        <w:t xml:space="preserve"> is a large </w:t>
+      </w:r>
+      <w:r>
+        <w:t xml:space="preserve">skyrmions </w:t>
+      </w:r>
+      <w:r>
+        <w:t xml:space="preserve">on a nanometer length scale? I suggest </w:t>
       </w:r>
       <w:proofErr w:type="gramStart"/>
       <w:r>
-        <w:t>wave-front</w:t>
+        <w:t>to rephrase</w:t>
       </w:r>
       <w:proofErr w:type="gramEnd"/>
       <w:r>
-        <w:t xml:space="preserve"> (Phys. Rev. B 107, L060407 (2023)), the time-dependent interference in the nonlinear photoemission processes (Phys. Rev. Research 6, 013163 (2024)), as well as the consecutive measurements with sample rotation (J. Synchrotron </w:t>
-      </w:r>
-      <w:r>
-        <w:lastRenderedPageBreak/>
-        <w:t>Rad. 31, 336 (2024)) have been demonstrated to image the more delicate local non-collinear magnetization orientations.</w:t>
-      </w:r>
-    </w:p>
-    <w:p>
-      <w:pPr>
-        <w:kinsoku w:val="0"/>
-        <w:overflowPunct w:val="0"/>
-        <w:spacing w:line="360" w:lineRule="auto"/>
-        <w:jc w:val="both"/>
-      </w:pPr>
-    </w:p>
-    <w:p>
-      <w:pPr>
-        <w:kinsoku w:val="0"/>
-        <w:overflowPunct w:val="0"/>
-        <w:spacing w:line="360" w:lineRule="auto"/>
-        <w:jc w:val="both"/>
-      </w:pPr>
-    </w:p>
-    <w:p>
-      <w:pPr>
-        <w:kinsoku w:val="0"/>
-        <w:overflowPunct w:val="0"/>
-        <w:spacing w:line="360" w:lineRule="auto"/>
-        <w:jc w:val="both"/>
-      </w:pPr>
-      <w:r>
-        <w:rPr>
-          <w:b/>
-          <w:bCs/>
-        </w:rPr>
-        <w:t>(</w:t>
-      </w:r>
-      <w:r>
-        <w:rPr>
-          <w:b/>
-          <w:bCs/>
-        </w:rPr>
-        <w:t>A.</w:t>
-      </w:r>
-      <w:r>
-        <w:rPr>
-          <w:b/>
-          <w:bCs/>
-        </w:rPr>
-        <w:t>7)</w:t>
-      </w:r>
-      <w:r>
-        <w:rPr>
-          <w:b/>
-          <w:bCs/>
-        </w:rPr>
-        <w:t xml:space="preserve"> Reviewer A</w:t>
-      </w:r>
-      <w:proofErr w:type="gramStart"/>
-      <w:r>
-        <w:t>: ”</w:t>
-      </w:r>
-      <w:proofErr w:type="gramEnd"/>
-      <w:r>
-        <w:t>Symmetric exchange interaction is the dominant interaction, what</w:t>
-      </w:r>
-      <w:r>
-        <w:t xml:space="preserve"> </w:t>
-      </w:r>
-      <w:r>
-        <w:t>about the antisymmetric exchange interaction (DMI)?</w:t>
-      </w:r>
-      <w:r>
-        <w:t>”</w:t>
+        <w:t xml:space="preserve"> this statement.</w:t>
       </w:r>
     </w:p>
     <w:p>
@@ -2410,433 +3531,16 @@
         <w:t>Reply</w:t>
       </w:r>
       <w:r>
-        <w:t>:</w:t>
-      </w:r>
-      <w:r>
-        <w:t xml:space="preserve"> The magnetic dichroism reported in our manuscript results from the presence of both spin-orbit interaction and exchange interaction in the electronic structure of</w:t>
-      </w:r>
-      <w:r>
-        <w:t xml:space="preserve"> bulk</w:t>
-      </w:r>
-      <w:r>
-        <w:t xml:space="preserve"> Fe. </w:t>
-      </w:r>
-      <w:r>
-        <w:t xml:space="preserve">Both of these spin-dependent interactions are also involved in the origin of the </w:t>
-      </w:r>
-      <w:r>
-        <w:t>Dzyaloshinskii</w:t>
-      </w:r>
-      <w:r>
-        <w:t xml:space="preserve">-Moriya interaction (DMI, I. </w:t>
-      </w:r>
-      <w:r>
-        <w:t>Dzyaloshinskii</w:t>
-      </w:r>
-      <w:r>
-        <w:t xml:space="preserve">, </w:t>
-      </w:r>
-      <w:r>
-        <w:t>J</w:t>
-      </w:r>
-      <w:r>
-        <w:t xml:space="preserve">. </w:t>
-      </w:r>
-      <w:r>
-        <w:t>Phys</w:t>
-      </w:r>
-      <w:r>
-        <w:t>.</w:t>
-      </w:r>
-      <w:r>
-        <w:t xml:space="preserve"> Chem</w:t>
-      </w:r>
-      <w:r>
-        <w:t>.</w:t>
-      </w:r>
-      <w:r>
-        <w:t xml:space="preserve"> Sol</w:t>
-      </w:r>
-      <w:r>
-        <w:t>.</w:t>
-      </w:r>
-      <w:r>
-        <w:t xml:space="preserve"> </w:t>
-      </w:r>
-      <w:r>
-        <w:rPr>
-          <w:b/>
-          <w:bCs/>
-        </w:rPr>
-        <w:t>4</w:t>
-      </w:r>
-      <w:r>
-        <w:t>,</w:t>
-      </w:r>
-      <w:r>
-        <w:t xml:space="preserve"> 241</w:t>
-      </w:r>
-      <w:r>
-        <w:t xml:space="preserve"> </w:t>
-      </w:r>
-      <w:r>
-        <w:t>(</w:t>
-      </w:r>
-      <w:r>
-        <w:t>1958</w:t>
-      </w:r>
-      <w:r>
-        <w:t>)</w:t>
-      </w:r>
-      <w:r>
-        <w:t xml:space="preserve">; T. Moriya, </w:t>
-      </w:r>
-      <w:r>
-        <w:t xml:space="preserve">Phys. Rev. </w:t>
-      </w:r>
-      <w:r>
-        <w:rPr>
-          <w:b/>
-          <w:bCs/>
-        </w:rPr>
-        <w:t>120</w:t>
-      </w:r>
-      <w:r>
-        <w:t>, 91</w:t>
-      </w:r>
-      <w:r>
-        <w:t xml:space="preserve"> (1960)). However, as has been nicely formulated by T. Moriya in his publication above, the DMI is a direct extension </w:t>
-      </w:r>
-      <w:r>
-        <w:t>of</w:t>
-      </w:r>
-      <w:r>
-        <w:t xml:space="preserve"> the super-exchange interaction</w:t>
-      </w:r>
-      <w:r>
-        <w:t xml:space="preserve"> </w:t>
-      </w:r>
-      <w:r>
-        <w:t xml:space="preserve">as </w:t>
-      </w:r>
-      <w:r>
-        <w:t>modelled by P. W. Anderson</w:t>
-      </w:r>
-      <w:r>
-        <w:t xml:space="preserve">, which </w:t>
-      </w:r>
-      <w:r>
-        <w:t xml:space="preserve">mainly </w:t>
-      </w:r>
-      <w:r>
-        <w:t>describes antiferromagnetic transition metal compounds with low electrical conductivity</w:t>
-      </w:r>
-      <w:r>
-        <w:t xml:space="preserve"> (</w:t>
-      </w:r>
-      <w:r>
-        <w:t xml:space="preserve">Phys. Rev. </w:t>
-      </w:r>
-      <w:r>
-        <w:rPr>
-          <w:b/>
-          <w:bCs/>
-        </w:rPr>
-        <w:t>115</w:t>
-      </w:r>
-      <w:r>
-        <w:t>, 2</w:t>
-      </w:r>
-      <w:r>
-        <w:t xml:space="preserve"> (1959))</w:t>
-      </w:r>
-      <w:r>
-        <w:t>.</w:t>
-      </w:r>
-      <w:r>
-        <w:t xml:space="preserve"> Despite that the DMI would hardly be applicable for the</w:t>
-      </w:r>
-      <w:r>
-        <w:t xml:space="preserve"> bulk Fe in our manuscript, it </w:t>
-      </w:r>
-      <w:r>
-        <w:t>c</w:t>
-      </w:r>
-      <w:r>
-        <w:t xml:space="preserve">ould be important for ultrathin Fe films </w:t>
-      </w:r>
-      <w:r>
-        <w:t xml:space="preserve">grown </w:t>
-      </w:r>
-      <w:r>
-        <w:t>on heavy metal substrate</w:t>
-      </w:r>
-      <w:r>
-        <w:t>s</w:t>
-      </w:r>
-      <w:r>
-        <w:t xml:space="preserve"> (</w:t>
-      </w:r>
-      <w:r>
-        <w:t xml:space="preserve">Phys. Rev. Lett. </w:t>
-      </w:r>
-      <w:r>
-        <w:rPr>
-          <w:b/>
-          <w:bCs/>
-        </w:rPr>
-        <w:t>104</w:t>
-      </w:r>
-      <w:r>
-        <w:t>, 137203</w:t>
-      </w:r>
-      <w:r>
-        <w:t xml:space="preserve"> (2010)).</w:t>
-      </w:r>
-      <w:r>
-        <w:t xml:space="preserve"> In addition, the DMI in transition metal compounds (</w:t>
-      </w:r>
-      <w:r>
-        <w:t xml:space="preserve">Proc. Phys. Soc. </w:t>
-      </w:r>
-      <w:r>
-        <w:rPr>
-          <w:b/>
-          <w:bCs/>
-        </w:rPr>
-        <w:t>79</w:t>
-      </w:r>
-      <w:r>
-        <w:t>, 394</w:t>
-      </w:r>
-      <w:r>
-        <w:t xml:space="preserve"> (1962)) has been</w:t>
-      </w:r>
-      <w:r>
-        <w:t xml:space="preserve"> previously</w:t>
-      </w:r>
-      <w:r>
-        <w:t xml:space="preserve"> observed by magnetic dichroic PEEM (</w:t>
-      </w:r>
-      <w:r>
-        <w:t xml:space="preserve">Phys. Rev. Lett. </w:t>
-      </w:r>
-      <w:r>
-        <w:rPr>
-          <w:b/>
-          <w:bCs/>
-        </w:rPr>
-        <w:t>106</w:t>
-      </w:r>
-      <w:r>
-        <w:t>, 107201</w:t>
-      </w:r>
-      <w:r>
-        <w:t xml:space="preserve"> (2011)).</w:t>
-      </w:r>
-    </w:p>
-    <w:p>
-      <w:pPr>
-        <w:kinsoku w:val="0"/>
-        <w:overflowPunct w:val="0"/>
-        <w:spacing w:line="360" w:lineRule="auto"/>
-        <w:jc w:val="both"/>
-      </w:pPr>
-    </w:p>
-    <w:p>
-      <w:pPr>
-        <w:kinsoku w:val="0"/>
-        <w:overflowPunct w:val="0"/>
-        <w:spacing w:line="360" w:lineRule="auto"/>
-        <w:jc w:val="both"/>
-      </w:pPr>
-    </w:p>
-    <w:p>
-      <w:pPr>
-        <w:kinsoku w:val="0"/>
-        <w:overflowPunct w:val="0"/>
-        <w:spacing w:line="360" w:lineRule="auto"/>
-        <w:jc w:val="both"/>
-      </w:pPr>
-      <w:r>
-        <w:rPr>
-          <w:b/>
-          <w:bCs/>
-        </w:rPr>
-        <w:t>(</w:t>
-      </w:r>
-      <w:r>
-        <w:rPr>
-          <w:b/>
-          <w:bCs/>
-        </w:rPr>
-        <w:t>A.</w:t>
-      </w:r>
-      <w:r>
-        <w:rPr>
-          <w:b/>
-          <w:bCs/>
-        </w:rPr>
-        <w:t>8)</w:t>
-      </w:r>
-      <w:r>
-        <w:rPr>
-          <w:b/>
-          <w:bCs/>
-        </w:rPr>
-        <w:t xml:space="preserve"> Reviewer A</w:t>
-      </w:r>
-      <w:proofErr w:type="gramStart"/>
-      <w:r>
-        <w:t>: ”</w:t>
-      </w:r>
-      <w:proofErr w:type="gramEnd"/>
-      <w:r>
-        <w:t>I am confused about Figs. 2 and 3 when comparing exp</w:t>
-      </w:r>
-      <w:r>
-        <w:t>eriments</w:t>
-      </w:r>
-      <w:r>
-        <w:t xml:space="preserve"> with theory. The</w:t>
-      </w:r>
-      <w:r>
-        <w:t xml:space="preserve"> </w:t>
-      </w:r>
-      <w:r>
-        <w:t>color codes seem to indicate a difference of about a factor 2 (40 vs</w:t>
-      </w:r>
-      <w:r>
-        <w:t xml:space="preserve"> </w:t>
-      </w:r>
-      <w:r>
-        <w:t>20 and 10 vs 6), but why would then the difference between max and min</w:t>
-      </w:r>
-      <w:r>
-        <w:t xml:space="preserve"> </w:t>
-      </w:r>
-      <w:r>
-        <w:t>not be visible in the experimental data? They seem to be much weaker</w:t>
-      </w:r>
-      <w:r>
-        <w:t xml:space="preserve"> </w:t>
-      </w:r>
-      <w:r>
-        <w:t xml:space="preserve">in contrast. Is there a mistake in the display settings? </w:t>
-      </w:r>
-      <w:proofErr w:type="gramStart"/>
-      <w:r>
-        <w:t>Also</w:t>
-      </w:r>
-      <w:proofErr w:type="gramEnd"/>
-      <w:r>
-        <w:t>, why are</w:t>
-      </w:r>
-      <w:r>
-        <w:t xml:space="preserve"> </w:t>
-      </w:r>
-      <w:r>
-        <w:t>the experimental data so noisy? Is this a result of statistics? If so,</w:t>
-      </w:r>
-      <w:r>
-        <w:t xml:space="preserve"> </w:t>
-      </w:r>
-      <w:r>
-        <w:t>why not accumulate better statistics?</w:t>
-      </w:r>
-      <w:r>
-        <w:t>”</w:t>
-      </w:r>
-    </w:p>
-    <w:p>
-      <w:pPr>
-        <w:kinsoku w:val="0"/>
-        <w:overflowPunct w:val="0"/>
-        <w:spacing w:line="360" w:lineRule="auto"/>
-        <w:jc w:val="both"/>
-      </w:pPr>
-    </w:p>
-    <w:p>
-      <w:pPr>
-        <w:kinsoku w:val="0"/>
-        <w:overflowPunct w:val="0"/>
-        <w:spacing w:line="360" w:lineRule="auto"/>
-        <w:jc w:val="both"/>
-      </w:pPr>
-      <w:r>
-        <w:rPr>
-          <w:b/>
-          <w:bCs/>
-        </w:rPr>
-        <w:t>Reply</w:t>
-      </w:r>
-      <w:r>
-        <w:t xml:space="preserve">: We thank the Reviewer for carefully pointing out that there exists a factor of 2 to 3 difference between the absolute values of the dichroic asymmetries </w:t>
+        <w:t xml:space="preserve">: As has been demonstrated in the very recent pioneering ultrafast diffraction experiments by </w:t>
+      </w:r>
+      <w:r>
+        <w:t xml:space="preserve">R. </w:t>
       </w:r>
       <w:proofErr w:type="spellStart"/>
       <w:r>
-        <w:t>A</w:t>
-      </w:r>
-      <w:r>
-        <w:rPr>
-          <w:vertAlign w:val="subscript"/>
-        </w:rPr>
-        <w:t>pol</w:t>
+        <w:t>Jangid</w:t>
       </w:r>
       <w:proofErr w:type="spellEnd"/>
-      <w:r>
-        <w:t xml:space="preserve"> (Fig.</w:t>
-      </w:r>
-      <w:r>
-        <w:rPr>
-          <w:rFonts w:ascii="Times New Roman" w:hAnsi="Times New Roman" w:cs="Times New Roman"/>
-        </w:rPr>
-        <w:t> </w:t>
-      </w:r>
-      <w:r>
-        <w:t xml:space="preserve">2) and </w:t>
-      </w:r>
-      <w:proofErr w:type="spellStart"/>
-      <w:r>
-        <w:t>A</w:t>
-      </w:r>
-      <w:r>
-        <w:rPr>
-          <w:vertAlign w:val="subscript"/>
-        </w:rPr>
-        <w:t>ex</w:t>
-      </w:r>
-      <w:proofErr w:type="spellEnd"/>
-      <w:r>
-        <w:t xml:space="preserve"> (Fig.</w:t>
-      </w:r>
-      <w:r>
-        <w:rPr>
-          <w:rFonts w:ascii="Times New Roman" w:hAnsi="Times New Roman" w:cs="Times New Roman"/>
-        </w:rPr>
-        <w:t> </w:t>
-      </w:r>
-      <w:r>
-        <w:t>3)</w:t>
-      </w:r>
-      <w:r>
-        <w:t xml:space="preserve"> from the experiments and theory</w:t>
-      </w:r>
-      <w:r>
-        <w:t>.</w:t>
-      </w:r>
-      <w:r>
-        <w:t xml:space="preserve"> In our </w:t>
-      </w:r>
-      <w:r>
-        <w:t>calculations,</w:t>
-      </w:r>
-      <w:r>
-        <w:t xml:space="preserve"> we did not use any</w:t>
-      </w:r>
-      <w:r>
-        <w:t xml:space="preserve"> specific</w:t>
-      </w:r>
       <w:r>
         <w:t xml:space="preserve"> </w:t>
       </w:r>
@@ -2845,655 +3549,444 @@
           <w:i/>
           <w:iCs/>
         </w:rPr>
-        <w:t>ad hoc</w:t>
-      </w:r>
-      <w:r>
-        <w:t xml:space="preserve"> parameters in order to remove this discrepancy between the experiments and theory.</w:t>
-      </w:r>
-      <w:r>
-        <w:t xml:space="preserve"> </w:t>
-      </w:r>
-      <w:r>
-        <w:t>Furthermore, for</w:t>
-      </w:r>
-      <w:r>
-        <w:t xml:space="preserve"> our experimental data in these figures, the difference between the maximum </w:t>
-      </w:r>
-      <w:r>
-        <w:t xml:space="preserve">and </w:t>
-      </w:r>
-      <w:r>
-        <w:t xml:space="preserve">minimum </w:t>
-      </w:r>
-      <w:r>
-        <w:t>in</w:t>
-      </w:r>
-      <w:r>
-        <w:t xml:space="preserve"> the </w:t>
+        <w:t>et al</w:t>
+      </w:r>
+      <w:r>
+        <w:t>. (</w:t>
+      </w:r>
+      <w:r>
+        <w:t xml:space="preserve">Phys. Rev. Lett. </w:t>
+      </w:r>
+      <w:r>
+        <w:rPr>
+          <w:b/>
+          <w:bCs/>
+        </w:rPr>
+        <w:t>131</w:t>
+      </w:r>
+      <w:r>
+        <w:t>, 256702</w:t>
+      </w:r>
+      <w:r>
+        <w:t xml:space="preserve"> (2023)),</w:t>
+      </w:r>
+      <w:r>
+        <w:t xml:space="preserve"> at the frontier of current research it is </w:t>
+      </w:r>
+      <w:r>
+        <w:t xml:space="preserve">generally </w:t>
+      </w:r>
+      <w:r>
+        <w:t xml:space="preserve">keenly needed to observe and understand </w:t>
+      </w:r>
+      <w:r>
+        <w:t xml:space="preserve">the </w:t>
+      </w:r>
+      <w:r>
+        <w:t>ultrafast magnetic domain wall motion.</w:t>
+      </w:r>
+      <w:r>
+        <w:t xml:space="preserve"> </w:t>
+      </w:r>
+      <w:proofErr w:type="gramStart"/>
+      <w:r>
+        <w:t>Despite that the domain pattern retrieved in that specific work</w:t>
+      </w:r>
+      <w:r>
+        <w:t xml:space="preserve"> above</w:t>
+      </w:r>
+      <w:r>
+        <w:t xml:space="preserve"> </w:t>
+      </w:r>
+      <w:r>
+        <w:t>with</w:t>
+      </w:r>
+      <w:r>
+        <w:t xml:space="preserve"> an average width of about 100</w:t>
+      </w:r>
+      <w:r>
+        <w:rPr>
+          <w:rFonts w:ascii="Times New Roman" w:hAnsi="Times New Roman" w:cs="Times New Roman"/>
+        </w:rPr>
+        <w:t> </w:t>
+      </w:r>
+      <w:r>
+        <w:t xml:space="preserve">nm may not be fully resolved by our photoelectron microscopy (PEEM) in </w:t>
+      </w:r>
+      <w:r>
+        <w:t xml:space="preserve">great </w:t>
+      </w:r>
+      <w:r>
+        <w:t>detail,</w:t>
+      </w:r>
+      <w:r>
+        <w:t xml:space="preserve"> it has been shown in previous PEEM experiments that a limited spatial resolution of about 600</w:t>
+      </w:r>
+      <w:r>
+        <w:rPr>
+          <w:rFonts w:ascii="Times New Roman" w:hAnsi="Times New Roman" w:cs="Times New Roman"/>
+        </w:rPr>
+        <w:t> </w:t>
+      </w:r>
+      <w:r>
+        <w:t xml:space="preserve">nm </w:t>
+      </w:r>
+      <w:r>
+        <w:t>is fully sufficient to accurately determine the position of the domain wall with a 30</w:t>
+      </w:r>
+      <w:r>
+        <w:rPr>
+          <w:rFonts w:ascii="Times New Roman" w:hAnsi="Times New Roman" w:cs="Times New Roman"/>
+        </w:rPr>
+        <w:t> </w:t>
+      </w:r>
+      <w:r>
+        <w:t>nm precision (</w:t>
+      </w:r>
+      <w:r>
+        <w:t xml:space="preserve">Phys. Rev. B </w:t>
+      </w:r>
+      <w:r>
+        <w:rPr>
+          <w:b/>
+          <w:bCs/>
+        </w:rPr>
+        <w:t>81</w:t>
+      </w:r>
+      <w:r>
+        <w:t>, 224418</w:t>
+      </w:r>
+      <w:r>
+        <w:t xml:space="preserve"> (2010)).</w:t>
+      </w:r>
+      <w:proofErr w:type="gramEnd"/>
+      <w:r>
+        <w:t xml:space="preserve"> In addition, h</w:t>
+      </w:r>
+      <w:r>
+        <w:t>ere we use “large skyrmions” to differentiate them from the skyrmions hav</w:t>
+      </w:r>
+      <w:r>
+        <w:t>ing</w:t>
+      </w:r>
+      <w:r>
+        <w:t xml:space="preserve"> a size of </w:t>
+      </w:r>
+      <w:r>
+        <w:t>less than 10 atomic distance</w:t>
+      </w:r>
+      <w:r>
+        <w:t xml:space="preserve"> (</w:t>
+      </w:r>
+      <w:r>
+        <w:t xml:space="preserve">Phys. Rev. Lett. </w:t>
+      </w:r>
+      <w:r>
+        <w:rPr>
+          <w:b/>
+          <w:bCs/>
+        </w:rPr>
+        <w:t>114</w:t>
+      </w:r>
+      <w:r>
+        <w:t>, 177203</w:t>
+      </w:r>
+      <w:r>
+        <w:t xml:space="preserve"> (2015)</w:t>
+      </w:r>
+      <w:r>
+        <w:t xml:space="preserve">; </w:t>
+      </w:r>
+      <w:r>
+        <w:t xml:space="preserve">Nat. </w:t>
       </w:r>
       <w:proofErr w:type="spellStart"/>
       <w:r>
-        <w:t>A</w:t>
-      </w:r>
-      <w:r>
-        <w:rPr>
-          <w:vertAlign w:val="subscript"/>
-        </w:rPr>
-        <w:t>pol</w:t>
+        <w:t>Commun</w:t>
       </w:r>
       <w:proofErr w:type="spellEnd"/>
       <w:r>
-        <w:t xml:space="preserve"> and </w:t>
-      </w:r>
-      <w:proofErr w:type="spellStart"/>
-      <w:r>
-        <w:t>A</w:t>
-      </w:r>
-      <w:r>
-        <w:rPr>
-          <w:vertAlign w:val="subscript"/>
-        </w:rPr>
-        <w:t>ex</w:t>
-      </w:r>
-      <w:proofErr w:type="spellEnd"/>
-      <w:r>
-        <w:t xml:space="preserve"> </w:t>
+        <w:t>.</w:t>
+      </w:r>
+      <w:r>
+        <w:rPr>
+          <w:b/>
+          <w:bCs/>
+        </w:rPr>
+        <w:t> 11</w:t>
+      </w:r>
+      <w:r>
+        <w:t>, 5925 (2020)</w:t>
+      </w:r>
+      <w:r>
+        <w:t>).</w:t>
+      </w:r>
+    </w:p>
+    <w:p>
+      <w:pPr>
+        <w:kinsoku w:val="0"/>
+        <w:overflowPunct w:val="0"/>
+        <w:spacing w:line="360" w:lineRule="auto"/>
+        <w:jc w:val="both"/>
+      </w:pPr>
+    </w:p>
+    <w:p>
+      <w:pPr>
+        <w:kinsoku w:val="0"/>
+        <w:overflowPunct w:val="0"/>
+        <w:spacing w:line="360" w:lineRule="auto"/>
+        <w:jc w:val="both"/>
+      </w:pPr>
+    </w:p>
+    <w:p>
+      <w:pPr>
+        <w:kinsoku w:val="0"/>
+        <w:overflowPunct w:val="0"/>
+        <w:spacing w:line="360" w:lineRule="auto"/>
+        <w:jc w:val="both"/>
+      </w:pPr>
+      <w:r>
+        <w:rPr>
+          <w:b/>
+          <w:bCs/>
+        </w:rPr>
+        <w:t>(</w:t>
+      </w:r>
+      <w:r>
+        <w:rPr>
+          <w:b/>
+          <w:bCs/>
+        </w:rPr>
+        <w:t>A.</w:t>
+      </w:r>
+      <w:r>
+        <w:rPr>
+          <w:b/>
+          <w:bCs/>
+        </w:rPr>
+        <w:t>12)</w:t>
+      </w:r>
+      <w:r>
+        <w:rPr>
+          <w:b/>
+          <w:bCs/>
+        </w:rPr>
+        <w:t xml:space="preserve"> Reviewer A</w:t>
       </w:r>
       <w:proofErr w:type="gramStart"/>
       <w:r>
-        <w:t>can be identified</w:t>
+        <w:t>: ”</w:t>
       </w:r>
       <w:proofErr w:type="gramEnd"/>
       <w:r>
-        <w:t xml:space="preserve"> by looking at the most intense red </w:t>
-      </w:r>
-      <w:r>
-        <w:t>and blue</w:t>
-      </w:r>
-      <w:r>
-        <w:t xml:space="preserve"> regions</w:t>
-      </w:r>
-      <w:r>
-        <w:t xml:space="preserve"> </w:t>
-      </w:r>
-      <w:r>
-        <w:lastRenderedPageBreak/>
-        <w:t>in the left columns of Fig.</w:t>
-      </w:r>
-      <w:r>
-        <w:rPr>
-          <w:rFonts w:ascii="Times New Roman" w:hAnsi="Times New Roman" w:cs="Times New Roman"/>
-        </w:rPr>
-        <w:t> </w:t>
-      </w:r>
-      <w:r>
-        <w:t>2 and Fig.</w:t>
-      </w:r>
-      <w:r>
-        <w:rPr>
-          <w:rFonts w:ascii="Times New Roman" w:hAnsi="Times New Roman" w:cs="Times New Roman"/>
-        </w:rPr>
-        <w:t> </w:t>
-      </w:r>
-      <w:r>
-        <w:t>3</w:t>
-      </w:r>
+        <w:t>I</w:t>
+      </w:r>
+      <w:r>
+        <w:t>n summary, I recommend a major revision. The authors also need to</w:t>
+      </w:r>
+      <w:r>
+        <w:t xml:space="preserve"> </w:t>
+      </w:r>
+      <w:r>
+        <w:t xml:space="preserve">demonstrate why PRL is the appropriate </w:t>
+      </w:r>
+      <w:proofErr w:type="gramStart"/>
+      <w:r>
+        <w:t>journal,</w:t>
+      </w:r>
+      <w:proofErr w:type="gramEnd"/>
+      <w:r>
+        <w:t xml:space="preserve"> I feel that PRB would</w:t>
+      </w:r>
+      <w:r>
+        <w:t xml:space="preserve"> </w:t>
+      </w:r>
+      <w:r>
+        <w:t>be the better choice for this work.</w:t>
+      </w:r>
+      <w:r>
+        <w:t>”</w:t>
+      </w:r>
+    </w:p>
+    <w:p>
+      <w:pPr>
+        <w:kinsoku w:val="0"/>
+        <w:overflowPunct w:val="0"/>
+        <w:spacing w:line="360" w:lineRule="auto"/>
+        <w:jc w:val="both"/>
+      </w:pPr>
+    </w:p>
+    <w:p>
+      <w:pPr>
+        <w:kinsoku w:val="0"/>
+        <w:overflowPunct w:val="0"/>
+        <w:spacing w:line="360" w:lineRule="auto"/>
+        <w:jc w:val="both"/>
+      </w:pPr>
+      <w:r>
+        <w:rPr>
+          <w:b/>
+          <w:bCs/>
+        </w:rPr>
+        <w:t>Reply</w:t>
+      </w:r>
+      <w:r>
+        <w:t xml:space="preserve">: We thank the Reviewer for kindly providing us with the opportunity to revise. With our detailed answers above, we </w:t>
+      </w:r>
+      <w:r>
+        <w:t>are confident</w:t>
+      </w:r>
+      <w:r>
+        <w:t xml:space="preserve"> that all the scientific questions </w:t>
+      </w:r>
+      <w:proofErr w:type="gramStart"/>
+      <w:r>
+        <w:t xml:space="preserve">are </w:t>
+      </w:r>
+      <w:r>
+        <w:t xml:space="preserve">now </w:t>
+      </w:r>
+      <w:r>
+        <w:t>satisfactorily addressed</w:t>
+      </w:r>
+      <w:proofErr w:type="gramEnd"/>
       <w:r>
         <w:t>.</w:t>
       </w:r>
       <w:r>
-        <w:t xml:space="preserve"> For a fair comparison, in these figures we specifically fix</w:t>
-      </w:r>
-      <w:r>
-        <w:t xml:space="preserve"> the range of </w:t>
+        <w:t xml:space="preserve"> Moreover, since our </w:t>
+      </w:r>
+      <w:r>
+        <w:t xml:space="preserve">joint experimental and theoretical </w:t>
+      </w:r>
+      <w:r>
+        <w:t>work is a major progress of photoelectron microscopy on magnetic imaging</w:t>
+      </w:r>
+      <w:r>
+        <w:t>,</w:t>
+      </w:r>
+      <w:r>
+        <w:t xml:space="preserve"> covering a wide range of readership from surface science, magnetism, and synchrotron research communities, we </w:t>
+      </w:r>
+      <w:r>
+        <w:t>hope that our choice to publish in the Physical Review Letters is reasonably justified.</w:t>
+      </w:r>
+    </w:p>
+    <w:p>
+      <w:pPr>
+        <w:kinsoku w:val="0"/>
+        <w:overflowPunct w:val="0"/>
+        <w:spacing w:line="360" w:lineRule="auto"/>
+        <w:jc w:val="both"/>
+      </w:pPr>
+    </w:p>
+    <w:p>
+      <w:pPr>
+        <w:kinsoku w:val="0"/>
+        <w:overflowPunct w:val="0"/>
+        <w:spacing w:line="360" w:lineRule="auto"/>
+        <w:jc w:val="both"/>
+      </w:pPr>
+    </w:p>
+    <w:p>
+      <w:pPr>
+        <w:kinsoku w:val="0"/>
+        <w:overflowPunct w:val="0"/>
+        <w:spacing w:line="360" w:lineRule="auto"/>
+        <w:jc w:val="both"/>
+        <w:rPr>
+          <w:b/>
+          <w:bCs/>
+          <w:u w:val="single"/>
+        </w:rPr>
+      </w:pPr>
+      <w:r>
+        <w:rPr>
+          <w:b/>
+          <w:bCs/>
+          <w:u w:val="single"/>
+        </w:rPr>
+        <w:t>Reviewer B</w:t>
+      </w:r>
+    </w:p>
+    <w:p>
+      <w:pPr>
+        <w:kinsoku w:val="0"/>
+        <w:overflowPunct w:val="0"/>
+        <w:spacing w:line="360" w:lineRule="auto"/>
+        <w:jc w:val="both"/>
+      </w:pPr>
+    </w:p>
+    <w:p>
+      <w:pPr>
+        <w:kinsoku w:val="0"/>
+        <w:overflowPunct w:val="0"/>
+        <w:spacing w:line="360" w:lineRule="auto"/>
+        <w:jc w:val="both"/>
+      </w:pPr>
+      <w:r>
+        <w:rPr>
+          <w:b/>
+          <w:bCs/>
+        </w:rPr>
+        <w:t>(B</w:t>
+      </w:r>
+      <w:r>
+        <w:rPr>
+          <w:b/>
+          <w:bCs/>
+        </w:rPr>
+        <w:t>.</w:t>
+      </w:r>
+      <w:r>
+        <w:rPr>
+          <w:b/>
+          <w:bCs/>
+        </w:rPr>
+        <w:t>1)</w:t>
+      </w:r>
+      <w:r>
+        <w:rPr>
+          <w:b/>
+          <w:bCs/>
+        </w:rPr>
+        <w:t xml:space="preserve"> Reviewer </w:t>
+      </w:r>
+      <w:r>
+        <w:rPr>
+          <w:b/>
+          <w:bCs/>
+        </w:rPr>
+        <w:t>B</w:t>
       </w:r>
       <w:proofErr w:type="gramStart"/>
       <w:r>
-        <w:t>color coding</w:t>
+        <w:t>: ”</w:t>
       </w:r>
       <w:proofErr w:type="gramEnd"/>
       <w:r>
-        <w:t>, so that the data at different energies can be directly compared.</w:t>
-      </w:r>
-      <w:r>
-        <w:t xml:space="preserve"> </w:t>
-      </w:r>
-      <w:r>
-        <w:t>Our calculations describe the direct photoemission process but do not include secondary electrons due to scattering events. The latter are always present in experimental data and reduce the absolute value of the dichroic asymmetries</w:t>
-      </w:r>
-      <w:r>
-        <w:t>.</w:t>
-      </w:r>
-    </w:p>
-    <w:p>
-      <w:pPr>
-        <w:kinsoku w:val="0"/>
-        <w:overflowPunct w:val="0"/>
-        <w:spacing w:line="360" w:lineRule="auto"/>
-        <w:jc w:val="both"/>
-      </w:pPr>
-      <w:r>
-        <w:t xml:space="preserve">The fluctuation in our experimental data </w:t>
-      </w:r>
-      <w:r>
-        <w:t xml:space="preserve">mainly </w:t>
-      </w:r>
-      <w:r>
-        <w:t xml:space="preserve">reflects the counting statistics of photoelectrons, which </w:t>
-      </w:r>
-      <w:proofErr w:type="gramStart"/>
-      <w:r>
-        <w:t>c</w:t>
-      </w:r>
-      <w:r>
-        <w:t>ould be reduced</w:t>
-      </w:r>
-      <w:proofErr w:type="gramEnd"/>
-      <w:r>
-        <w:t xml:space="preserve"> </w:t>
-      </w:r>
-      <w:r>
-        <w:t>if</w:t>
-      </w:r>
-      <w:r>
-        <w:t xml:space="preserve"> a</w:t>
-      </w:r>
-      <w:r>
-        <w:t>n order-of-magnitude longer</w:t>
-      </w:r>
-      <w:r>
-        <w:t xml:space="preserve"> measur</w:t>
-      </w:r>
-      <w:r>
-        <w:t>ement time would be applied. However, the improvement of the counting statistics at small binding energies close to the Fermi level (E</w:t>
-      </w:r>
-      <w:r>
-        <w:rPr>
-          <w:vertAlign w:val="subscript"/>
-        </w:rPr>
-        <w:t>F</w:t>
-      </w:r>
-      <w:r>
-        <w:t xml:space="preserve">), such as </w:t>
-      </w:r>
-      <w:proofErr w:type="spellStart"/>
-      <w:r>
-        <w:t>A</w:t>
-      </w:r>
-      <w:r>
-        <w:rPr>
-          <w:vertAlign w:val="subscript"/>
-        </w:rPr>
-        <w:t>ex</w:t>
-      </w:r>
-      <w:proofErr w:type="spellEnd"/>
-      <w:r>
-        <w:t xml:space="preserve"> at 0.05 eV in the top-most left panel of Fig.</w:t>
-      </w:r>
-      <w:r>
-        <w:rPr>
-          <w:rFonts w:ascii="Times New Roman" w:hAnsi="Times New Roman" w:cs="Times New Roman"/>
-        </w:rPr>
-        <w:t> </w:t>
-      </w:r>
-      <w:r>
-        <w:t>3, would still be limited intrinsically by the reduced photoemission intensity close to E</w:t>
-      </w:r>
-      <w:r>
-        <w:rPr>
-          <w:vertAlign w:val="subscript"/>
-        </w:rPr>
-        <w:t>F</w:t>
-      </w:r>
-      <w:r>
-        <w:t>. More importantly, the main physics discussed in our manuscript will still hold</w:t>
-      </w:r>
-      <w:r>
-        <w:t xml:space="preserve"> as supported by the</w:t>
-      </w:r>
-      <w:r>
-        <w:t xml:space="preserve"> reasonable</w:t>
-      </w:r>
-      <w:r>
-        <w:t xml:space="preserve"> qualitative agreement between our experiments and theoretical calculations in Fig.</w:t>
-      </w:r>
-      <w:r>
-        <w:rPr>
-          <w:rFonts w:ascii="Times New Roman" w:hAnsi="Times New Roman" w:cs="Times New Roman"/>
-        </w:rPr>
-        <w:t> </w:t>
-      </w:r>
-      <w:r>
-        <w:t>2 and Fig.</w:t>
-      </w:r>
-      <w:r>
-        <w:rPr>
-          <w:rFonts w:ascii="Times New Roman" w:hAnsi="Times New Roman" w:cs="Times New Roman"/>
-        </w:rPr>
-        <w:t> </w:t>
-      </w:r>
-      <w:r>
-        <w:t>3</w:t>
-      </w:r>
-      <w:r>
-        <w:t>.</w:t>
-      </w:r>
-    </w:p>
-    <w:p>
-      <w:pPr>
-        <w:kinsoku w:val="0"/>
-        <w:overflowPunct w:val="0"/>
-        <w:spacing w:line="360" w:lineRule="auto"/>
-        <w:jc w:val="both"/>
-      </w:pPr>
-    </w:p>
-    <w:p>
-      <w:pPr>
-        <w:kinsoku w:val="0"/>
-        <w:overflowPunct w:val="0"/>
-        <w:spacing w:line="360" w:lineRule="auto"/>
-        <w:jc w:val="both"/>
-      </w:pPr>
-    </w:p>
-    <w:p>
-      <w:pPr>
-        <w:kinsoku w:val="0"/>
-        <w:overflowPunct w:val="0"/>
-        <w:spacing w:line="360" w:lineRule="auto"/>
-        <w:jc w:val="both"/>
-      </w:pPr>
-      <w:r>
-        <w:rPr>
-          <w:b/>
-          <w:bCs/>
-        </w:rPr>
-        <w:t>(</w:t>
-      </w:r>
-      <w:r>
-        <w:rPr>
-          <w:b/>
-          <w:bCs/>
-        </w:rPr>
-        <w:t>A.</w:t>
-      </w:r>
-      <w:r>
-        <w:rPr>
-          <w:b/>
-          <w:bCs/>
-        </w:rPr>
-        <w:t>9)</w:t>
-      </w:r>
-      <w:r>
-        <w:rPr>
-          <w:b/>
-          <w:bCs/>
-        </w:rPr>
-        <w:t xml:space="preserve"> Reviewer A</w:t>
-      </w:r>
-      <w:proofErr w:type="gramStart"/>
-      <w:r>
-        <w:t>: ”</w:t>
-      </w:r>
-      <w:proofErr w:type="gramEnd"/>
-      <w:r>
-        <w:t>Fig. 4 needs a length scale bar and I highly encourage the authors to</w:t>
-      </w:r>
-      <w:r>
-        <w:t xml:space="preserve"> </w:t>
-      </w:r>
-      <w:r>
-        <w:t>discuss spatial resolution.</w:t>
-      </w:r>
-      <w:r>
-        <w:t>”</w:t>
-      </w:r>
-    </w:p>
-    <w:p>
-      <w:pPr>
-        <w:kinsoku w:val="0"/>
-        <w:overflowPunct w:val="0"/>
-        <w:spacing w:line="360" w:lineRule="auto"/>
-        <w:jc w:val="both"/>
-      </w:pPr>
-    </w:p>
-    <w:p>
-      <w:pPr>
-        <w:kinsoku w:val="0"/>
-        <w:overflowPunct w:val="0"/>
-        <w:spacing w:line="360" w:lineRule="auto"/>
-        <w:jc w:val="both"/>
-      </w:pPr>
-      <w:r>
-        <w:rPr>
-          <w:b/>
-          <w:bCs/>
-        </w:rPr>
-        <w:t>Reply</w:t>
-      </w:r>
-      <w:r>
-        <w:t>:</w:t>
-      </w:r>
-      <w:r>
-        <w:t xml:space="preserve"> The size of all figures in Fig.</w:t>
-      </w:r>
-      <w:r>
-        <w:rPr>
-          <w:rFonts w:ascii="Times New Roman" w:hAnsi="Times New Roman" w:cs="Times New Roman"/>
-        </w:rPr>
-        <w:t> </w:t>
-      </w:r>
-      <w:r>
-        <w:t>4</w:t>
-      </w:r>
-      <w:r>
-        <w:t xml:space="preserve"> </w:t>
-      </w:r>
-      <w:r>
-        <w:t>is 56</w:t>
-      </w:r>
-      <w:r>
-        <w:rPr>
-          <w:rFonts w:ascii="Times New Roman" w:hAnsi="Times New Roman" w:cs="Times New Roman"/>
-        </w:rPr>
-        <w:t> </w:t>
-      </w:r>
-      <w:proofErr w:type="spellStart"/>
-      <w:r>
-        <w:t>μm</w:t>
-      </w:r>
-      <w:proofErr w:type="spellEnd"/>
-      <w:r>
-        <w:t xml:space="preserve"> x 56</w:t>
-      </w:r>
-      <w:r>
-        <w:rPr>
-          <w:rFonts w:ascii="Times New Roman" w:hAnsi="Times New Roman" w:cs="Times New Roman"/>
-        </w:rPr>
-        <w:t> </w:t>
-      </w:r>
-      <w:proofErr w:type="spellStart"/>
-      <w:r>
-        <w:t>μm</w:t>
-      </w:r>
-      <w:proofErr w:type="spellEnd"/>
-      <w:r>
-        <w:t xml:space="preserve"> as written in </w:t>
-      </w:r>
-      <w:r>
-        <w:t>the</w:t>
-      </w:r>
-      <w:r>
-        <w:t xml:space="preserve"> figure caption, and the spatial resolution is</w:t>
-      </w:r>
-      <w:r>
-        <w:t xml:space="preserve"> address</w:t>
-      </w:r>
-      <w:r>
-        <w:t>ed</w:t>
-      </w:r>
-      <w:r>
-        <w:t xml:space="preserve"> above in </w:t>
-      </w:r>
-      <w:r>
-        <w:rPr>
-          <w:b/>
-          <w:bCs/>
-        </w:rPr>
-        <w:t xml:space="preserve">(A.5) </w:t>
-      </w:r>
-      <w:r>
-        <w:t xml:space="preserve">in </w:t>
-      </w:r>
-      <w:r>
-        <w:t xml:space="preserve">great </w:t>
-      </w:r>
-      <w:r>
-        <w:t>detail</w:t>
-      </w:r>
-      <w:r>
-        <w:t xml:space="preserve"> as well as added in the manuscript.</w:t>
-      </w:r>
-    </w:p>
-    <w:p>
-      <w:pPr>
-        <w:kinsoku w:val="0"/>
-        <w:overflowPunct w:val="0"/>
-        <w:spacing w:line="360" w:lineRule="auto"/>
-        <w:jc w:val="both"/>
-      </w:pPr>
-    </w:p>
-    <w:p>
-      <w:pPr>
-        <w:kinsoku w:val="0"/>
-        <w:overflowPunct w:val="0"/>
-        <w:spacing w:line="360" w:lineRule="auto"/>
-        <w:jc w:val="both"/>
-      </w:pPr>
-    </w:p>
-    <w:p>
-      <w:pPr>
-        <w:kinsoku w:val="0"/>
-        <w:overflowPunct w:val="0"/>
-        <w:spacing w:line="360" w:lineRule="auto"/>
-        <w:jc w:val="both"/>
-      </w:pPr>
-      <w:r>
-        <w:rPr>
-          <w:b/>
-          <w:bCs/>
-        </w:rPr>
-        <w:t>(</w:t>
-      </w:r>
-      <w:r>
-        <w:rPr>
-          <w:b/>
-          <w:bCs/>
-        </w:rPr>
-        <w:t>A.</w:t>
-      </w:r>
-      <w:r>
-        <w:rPr>
-          <w:b/>
-          <w:bCs/>
-        </w:rPr>
-        <w:t>10)</w:t>
-      </w:r>
-      <w:r>
-        <w:rPr>
-          <w:b/>
-          <w:bCs/>
-        </w:rPr>
-        <w:t xml:space="preserve"> Reviewer A</w:t>
-      </w:r>
-      <w:proofErr w:type="gramStart"/>
-      <w:r>
-        <w:t>: ”</w:t>
-      </w:r>
-      <w:proofErr w:type="gramEnd"/>
-      <w:r>
-        <w:t>ARPES in Ref. [25, 28]. Why do the authors only mention their own</w:t>
-      </w:r>
-      <w:r>
-        <w:t xml:space="preserve"> </w:t>
-      </w:r>
-      <w:r>
-        <w:t>work? There are numerous ARPES reviews, which might be better suited.</w:t>
-      </w:r>
-      <w:r>
-        <w:t>”</w:t>
-      </w:r>
-    </w:p>
-    <w:p>
-      <w:pPr>
-        <w:kinsoku w:val="0"/>
-        <w:overflowPunct w:val="0"/>
-        <w:spacing w:line="360" w:lineRule="auto"/>
-        <w:jc w:val="both"/>
-        <w:rPr>
-          <w:b/>
-          <w:bCs/>
-        </w:rPr>
-      </w:pPr>
-    </w:p>
-    <w:p>
-      <w:pPr>
-        <w:kinsoku w:val="0"/>
-        <w:overflowPunct w:val="0"/>
-        <w:spacing w:line="360" w:lineRule="auto"/>
-        <w:jc w:val="both"/>
-      </w:pPr>
-      <w:r>
-        <w:rPr>
-          <w:b/>
-          <w:bCs/>
-        </w:rPr>
-        <w:t>Reply</w:t>
-      </w:r>
-      <w:r>
-        <w:t xml:space="preserve">: </w:t>
-      </w:r>
-      <w:r>
-        <w:t xml:space="preserve">We thank the Reviewer for this hint, but in that paragraph of our manuscript we </w:t>
-      </w:r>
-      <w:r>
-        <w:t>are</w:t>
-      </w:r>
-      <w:r>
-        <w:t xml:space="preserve"> only citing our experimental setup (to shorten the manuscript) and d</w:t>
-      </w:r>
-      <w:r>
-        <w:t>o not discuss any ARPES spectra</w:t>
-      </w:r>
-      <w:r>
-        <w:t>.</w:t>
-      </w:r>
-    </w:p>
-    <w:p>
-      <w:pPr>
-        <w:kinsoku w:val="0"/>
-        <w:overflowPunct w:val="0"/>
-        <w:spacing w:line="360" w:lineRule="auto"/>
-        <w:jc w:val="both"/>
-      </w:pPr>
-    </w:p>
-    <w:p>
-      <w:pPr>
-        <w:kinsoku w:val="0"/>
-        <w:overflowPunct w:val="0"/>
-        <w:spacing w:line="360" w:lineRule="auto"/>
-        <w:jc w:val="both"/>
-      </w:pPr>
-      <w:r>
-        <w:rPr>
-          <w:b/>
-          <w:bCs/>
-        </w:rPr>
-        <w:t>(</w:t>
-      </w:r>
-      <w:r>
-        <w:rPr>
-          <w:b/>
-          <w:bCs/>
-        </w:rPr>
-        <w:t>A.</w:t>
-      </w:r>
-      <w:r>
-        <w:rPr>
-          <w:b/>
-          <w:bCs/>
-        </w:rPr>
-        <w:t>11)</w:t>
-      </w:r>
-      <w:r>
-        <w:rPr>
-          <w:b/>
-          <w:bCs/>
-        </w:rPr>
-        <w:t xml:space="preserve"> Reviewer A</w:t>
-      </w:r>
-      <w:proofErr w:type="gramStart"/>
-      <w:r>
-        <w:t>: ”</w:t>
-      </w:r>
-      <w:proofErr w:type="gramEnd"/>
-      <w:r>
-        <w:t>Last sentence: "This capability opens new avenues for studying the</w:t>
-      </w:r>
-      <w:r>
-        <w:t xml:space="preserve"> </w:t>
-      </w:r>
-      <w:r>
-        <w:t>ultrafast motion of domain walls [32] or large skyrmions on nanometer</w:t>
-      </w:r>
-      <w:r>
-        <w:t xml:space="preserve"> </w:t>
-      </w:r>
-      <w:r>
-        <w:t>length scales [33–35]</w:t>
-      </w:r>
-      <w:r>
-        <w:t>.</w:t>
-      </w:r>
-      <w:r>
-        <w:t>"</w:t>
-      </w:r>
-      <w:r>
-        <w:t xml:space="preserve"> </w:t>
-      </w:r>
-      <w:r>
-        <w:t>I would disagree with those statements. D</w:t>
-      </w:r>
-      <w:r>
-        <w:t>omain wall</w:t>
-      </w:r>
-      <w:r>
-        <w:t>s might not be the most</w:t>
-      </w:r>
-      <w:r>
-        <w:t xml:space="preserve"> </w:t>
-      </w:r>
-      <w:r>
-        <w:t>important objects to study with</w:t>
-      </w:r>
-      <w:r>
-        <w:t xml:space="preserve"> ultrafast</w:t>
-      </w:r>
-      <w:r>
-        <w:t xml:space="preserve"> techniques, particularly, if the</w:t>
-      </w:r>
-      <w:r>
-        <w:t xml:space="preserve"> </w:t>
-      </w:r>
-      <w:r>
-        <w:t xml:space="preserve">microscopy cannot resolve </w:t>
-      </w:r>
-      <w:r>
-        <w:t>domain wall</w:t>
-      </w:r>
-      <w:r>
-        <w:t xml:space="preserve">s at all. Second. </w:t>
-      </w:r>
-      <w:proofErr w:type="gramStart"/>
-      <w:r>
-        <w:t>what</w:t>
-      </w:r>
-      <w:proofErr w:type="gramEnd"/>
-      <w:r>
-        <w:t xml:space="preserve"> is a large </w:t>
-      </w:r>
-      <w:r>
-        <w:t xml:space="preserve">skyrmions </w:t>
-      </w:r>
-      <w:r>
-        <w:t xml:space="preserve">on a nanometer length scale? I suggest </w:t>
-      </w:r>
-      <w:proofErr w:type="gramStart"/>
-      <w:r>
-        <w:t>to rephrase</w:t>
-      </w:r>
-      <w:proofErr w:type="gramEnd"/>
-      <w:r>
-        <w:t xml:space="preserve"> this statement.</w:t>
+        <w:t>In a revision, however, the authors should address the</w:t>
+      </w:r>
+      <w:r>
+        <w:t xml:space="preserve"> </w:t>
+      </w:r>
+      <w:r>
+        <w:t>requirements for surface preparation and the need for crystalline</w:t>
+      </w:r>
+      <w:r>
+        <w:t xml:space="preserve"> </w:t>
+      </w:r>
+      <w:r>
+        <w:t>samples. It would also be interesting to know how much the intensity</w:t>
+      </w:r>
+      <w:r>
+        <w:t xml:space="preserve"> </w:t>
+      </w:r>
+      <w:r>
+        <w:t>decreases in the dark-field images shown</w:t>
+      </w:r>
+      <w:r>
+        <w:t>.”</w:t>
       </w:r>
     </w:p>
     <w:p>
@@ -3520,530 +4013,45 @@
         <w:t>Reply</w:t>
       </w:r>
       <w:r>
-        <w:t xml:space="preserve">: As has been demonstrated in the very recent pioneering ultrafast diffraction experiments by </w:t>
-      </w:r>
-      <w:r>
-        <w:t xml:space="preserve">R. </w:t>
-      </w:r>
-      <w:proofErr w:type="spellStart"/>
-      <w:r>
-        <w:t>Jangid</w:t>
-      </w:r>
-      <w:proofErr w:type="spellEnd"/>
-      <w:r>
-        <w:t xml:space="preserve"> </w:t>
-      </w:r>
-      <w:r>
-        <w:rPr>
-          <w:i/>
-          <w:iCs/>
-        </w:rPr>
-        <w:t>et al</w:t>
-      </w:r>
-      <w:r>
-        <w:t>. (</w:t>
-      </w:r>
-      <w:r>
-        <w:t xml:space="preserve">Phys. Rev. Lett. </w:t>
-      </w:r>
-      <w:r>
-        <w:rPr>
-          <w:b/>
-          <w:bCs/>
-        </w:rPr>
-        <w:t>131</w:t>
-      </w:r>
-      <w:r>
-        <w:t>, 256702</w:t>
-      </w:r>
-      <w:r>
-        <w:t xml:space="preserve"> (2023)),</w:t>
-      </w:r>
-      <w:r>
-        <w:t xml:space="preserve"> at the frontier of current research it is </w:t>
-      </w:r>
-      <w:r>
-        <w:t xml:space="preserve">generally </w:t>
-      </w:r>
-      <w:r>
-        <w:t xml:space="preserve">keenly needed to observe and understand </w:t>
-      </w:r>
-      <w:r>
-        <w:t xml:space="preserve">the </w:t>
-      </w:r>
-      <w:r>
-        <w:t>ultrafast magnetic domain wall motion.</w:t>
-      </w:r>
-      <w:r>
-        <w:t xml:space="preserve"> </w:t>
+        <w:t xml:space="preserve">: </w:t>
+      </w:r>
+      <w:r>
+        <w:t>The preparation of sample surfaces include</w:t>
+      </w:r>
+      <w:r>
+        <w:t>s</w:t>
+      </w:r>
+      <w:r>
+        <w:t xml:space="preserve"> standard surface science procedures in the ultrahigh vacuum chamber such as cleaning with noble gas ion sputtering</w:t>
+      </w:r>
+      <w:r>
+        <w:t xml:space="preserve"> and</w:t>
+      </w:r>
+      <w:r>
+        <w:t xml:space="preserve"> annealing in </w:t>
+      </w:r>
+      <w:r>
+        <w:t xml:space="preserve">ultrahigh </w:t>
+      </w:r>
+      <w:r>
+        <w:t>vacuum to recover the surface crystallinity</w:t>
+      </w:r>
+      <w:r>
+        <w:t>.</w:t>
+      </w:r>
+      <w:r>
+        <w:t xml:space="preserve"> </w:t>
+      </w:r>
+      <w:r>
+        <w:t xml:space="preserve">The surface quality </w:t>
       </w:r>
       <w:proofErr w:type="gramStart"/>
       <w:r>
-        <w:t>Despite that the domain pattern retrieved in that specific work</w:t>
-      </w:r>
-      <w:r>
-        <w:t xml:space="preserve"> above</w:t>
-      </w:r>
-      <w:r>
-        <w:t xml:space="preserve"> </w:t>
-      </w:r>
-      <w:r>
-        <w:t>with</w:t>
-      </w:r>
-      <w:r>
-        <w:t xml:space="preserve"> an average width of about 100</w:t>
-      </w:r>
-      <w:r>
-        <w:rPr>
-          <w:rFonts w:ascii="Times New Roman" w:hAnsi="Times New Roman" w:cs="Times New Roman"/>
-        </w:rPr>
-        <w:t> </w:t>
-      </w:r>
-      <w:r>
-        <w:t xml:space="preserve">nm may not be fully resolved by our photoelectron microscopy (PEEM) in </w:t>
-      </w:r>
-      <w:r>
-        <w:t xml:space="preserve">great </w:t>
-      </w:r>
-      <w:r>
-        <w:t>detail,</w:t>
-      </w:r>
-      <w:r>
-        <w:t xml:space="preserve"> it has been shown in previous PEEM experiments that a limited spatial resolution of about 600</w:t>
-      </w:r>
-      <w:r>
-        <w:rPr>
-          <w:rFonts w:ascii="Times New Roman" w:hAnsi="Times New Roman" w:cs="Times New Roman"/>
-        </w:rPr>
-        <w:t> </w:t>
-      </w:r>
-      <w:r>
-        <w:t xml:space="preserve">nm </w:t>
-      </w:r>
-      <w:r>
-        <w:t>is fully sufficient to accurately determine the position of the domain wall with a 30</w:t>
-      </w:r>
-      <w:r>
-        <w:rPr>
-          <w:rFonts w:ascii="Times New Roman" w:hAnsi="Times New Roman" w:cs="Times New Roman"/>
-        </w:rPr>
-        <w:t> </w:t>
-      </w:r>
-      <w:r>
-        <w:t>nm precision (</w:t>
-      </w:r>
-      <w:r>
-        <w:t xml:space="preserve">Phys. Rev. B </w:t>
-      </w:r>
-      <w:r>
-        <w:rPr>
-          <w:b/>
-          <w:bCs/>
-        </w:rPr>
-        <w:t>81</w:t>
-      </w:r>
-      <w:r>
-        <w:t>, 224418</w:t>
-      </w:r>
-      <w:r>
-        <w:t xml:space="preserve"> (2010)).</w:t>
+        <w:t>has been confirmed</w:t>
       </w:r>
       <w:proofErr w:type="gramEnd"/>
       <w:r>
-        <w:t xml:space="preserve"> In addition, h</w:t>
-      </w:r>
-      <w:r>
-        <w:t>ere we use “large skyrmions” to differentiate them from the skyrmions hav</w:t>
-      </w:r>
-      <w:r>
-        <w:t>ing</w:t>
-      </w:r>
-      <w:r>
-        <w:t xml:space="preserve"> a size of </w:t>
-      </w:r>
-      <w:r>
-        <w:t>less than 10 atomic distance</w:t>
-      </w:r>
-      <w:r>
-        <w:t xml:space="preserve"> (</w:t>
-      </w:r>
-      <w:r>
-        <w:t xml:space="preserve">Phys. Rev. Lett. </w:t>
-      </w:r>
-      <w:r>
-        <w:rPr>
-          <w:b/>
-          <w:bCs/>
-        </w:rPr>
-        <w:t>114</w:t>
-      </w:r>
-      <w:r>
-        <w:t>, 177203</w:t>
-      </w:r>
-      <w:r>
-        <w:t xml:space="preserve"> (2015)</w:t>
-      </w:r>
-      <w:r>
-        <w:t xml:space="preserve">; </w:t>
-      </w:r>
-      <w:r>
-        <w:t xml:space="preserve">Nat. </w:t>
-      </w:r>
-      <w:proofErr w:type="spellStart"/>
-      <w:r>
-        <w:t>Commun</w:t>
-      </w:r>
-      <w:proofErr w:type="spellEnd"/>
-      <w:r>
-        <w:t>.</w:t>
-      </w:r>
-      <w:r>
-        <w:rPr>
-          <w:b/>
-          <w:bCs/>
-        </w:rPr>
-        <w:t> 11</w:t>
-      </w:r>
-      <w:r>
-        <w:t>, 5925 (2020)</w:t>
-      </w:r>
-      <w:r>
-        <w:t>).</w:t>
-      </w:r>
-    </w:p>
-    <w:p>
-      <w:pPr>
-        <w:kinsoku w:val="0"/>
-        <w:overflowPunct w:val="0"/>
-        <w:spacing w:line="360" w:lineRule="auto"/>
-        <w:jc w:val="both"/>
-      </w:pPr>
-    </w:p>
-    <w:p>
-      <w:pPr>
-        <w:kinsoku w:val="0"/>
-        <w:overflowPunct w:val="0"/>
-        <w:spacing w:line="360" w:lineRule="auto"/>
-        <w:jc w:val="both"/>
-      </w:pPr>
-    </w:p>
-    <w:p>
-      <w:pPr>
-        <w:kinsoku w:val="0"/>
-        <w:overflowPunct w:val="0"/>
-        <w:spacing w:line="360" w:lineRule="auto"/>
-        <w:jc w:val="both"/>
-      </w:pPr>
-      <w:r>
-        <w:rPr>
-          <w:b/>
-          <w:bCs/>
-        </w:rPr>
-        <w:t>(</w:t>
-      </w:r>
-      <w:r>
-        <w:rPr>
-          <w:b/>
-          <w:bCs/>
-        </w:rPr>
-        <w:t>A.</w:t>
-      </w:r>
-      <w:r>
-        <w:rPr>
-          <w:b/>
-          <w:bCs/>
-        </w:rPr>
-        <w:t>12)</w:t>
-      </w:r>
-      <w:r>
-        <w:rPr>
-          <w:b/>
-          <w:bCs/>
-        </w:rPr>
-        <w:t xml:space="preserve"> Reviewer A</w:t>
-      </w:r>
-      <w:proofErr w:type="gramStart"/>
-      <w:r>
-        <w:t>: ”</w:t>
-      </w:r>
-      <w:proofErr w:type="gramEnd"/>
-      <w:r>
-        <w:t>I</w:t>
-      </w:r>
-      <w:r>
-        <w:t>n summary, I recommend a major revision. The authors also need to</w:t>
-      </w:r>
-      <w:r>
-        <w:t xml:space="preserve"> </w:t>
-      </w:r>
-      <w:r>
-        <w:t xml:space="preserve">demonstrate why PRL is the appropriate </w:t>
-      </w:r>
-      <w:proofErr w:type="gramStart"/>
-      <w:r>
-        <w:t>journal,</w:t>
-      </w:r>
-      <w:proofErr w:type="gramEnd"/>
-      <w:r>
-        <w:t xml:space="preserve"> I feel that PRB would</w:t>
-      </w:r>
-      <w:r>
-        <w:t xml:space="preserve"> </w:t>
-      </w:r>
-      <w:r>
-        <w:t>be the better choice for this work.</w:t>
-      </w:r>
-      <w:r>
-        <w:t>”</w:t>
-      </w:r>
-    </w:p>
-    <w:p>
-      <w:pPr>
-        <w:kinsoku w:val="0"/>
-        <w:overflowPunct w:val="0"/>
-        <w:spacing w:line="360" w:lineRule="auto"/>
-        <w:jc w:val="both"/>
-      </w:pPr>
-    </w:p>
-    <w:p>
-      <w:pPr>
-        <w:kinsoku w:val="0"/>
-        <w:overflowPunct w:val="0"/>
-        <w:spacing w:line="360" w:lineRule="auto"/>
-        <w:jc w:val="both"/>
-      </w:pPr>
-      <w:r>
-        <w:rPr>
-          <w:b/>
-          <w:bCs/>
-        </w:rPr>
-        <w:t>Reply</w:t>
-      </w:r>
-      <w:r>
-        <w:t xml:space="preserve">: We thank the Reviewer for kindly providing us with the opportunity to revise. With our detailed answers above, we </w:t>
-      </w:r>
-      <w:r>
-        <w:t>are confident</w:t>
-      </w:r>
-      <w:r>
-        <w:t xml:space="preserve"> that all the scientific questions </w:t>
-      </w:r>
-      <w:proofErr w:type="gramStart"/>
-      <w:r>
-        <w:t xml:space="preserve">are </w:t>
-      </w:r>
-      <w:r>
-        <w:t xml:space="preserve">now </w:t>
-      </w:r>
-      <w:r>
-        <w:t>satisfactorily addressed</w:t>
-      </w:r>
-      <w:proofErr w:type="gramEnd"/>
-      <w:r>
-        <w:t>.</w:t>
-      </w:r>
-      <w:r>
-        <w:t xml:space="preserve"> Moreover, since our </w:t>
-      </w:r>
-      <w:r>
-        <w:t xml:space="preserve">joint experimental and theoretical </w:t>
-      </w:r>
-      <w:r>
-        <w:t>work is a major progress of photoelectron microscopy on magnetic imaging</w:t>
-      </w:r>
-      <w:r>
-        <w:t>,</w:t>
-      </w:r>
-      <w:r>
-        <w:t xml:space="preserve"> covering a wide range of readership from surface science, magnetism, and synchrotron research communities, we </w:t>
-      </w:r>
-      <w:r>
-        <w:t>hope that our choice to publish in the Physical Review Letters is reasonably justified.</w:t>
-      </w:r>
-    </w:p>
-    <w:p>
-      <w:pPr>
-        <w:kinsoku w:val="0"/>
-        <w:overflowPunct w:val="0"/>
-        <w:spacing w:line="360" w:lineRule="auto"/>
-        <w:jc w:val="both"/>
-      </w:pPr>
-    </w:p>
-    <w:p>
-      <w:pPr>
-        <w:kinsoku w:val="0"/>
-        <w:overflowPunct w:val="0"/>
-        <w:spacing w:line="360" w:lineRule="auto"/>
-        <w:jc w:val="both"/>
-      </w:pPr>
-    </w:p>
-    <w:p>
-      <w:pPr>
-        <w:kinsoku w:val="0"/>
-        <w:overflowPunct w:val="0"/>
-        <w:spacing w:line="360" w:lineRule="auto"/>
-        <w:jc w:val="both"/>
-        <w:rPr>
-          <w:b/>
-          <w:bCs/>
-          <w:u w:val="single"/>
-        </w:rPr>
-      </w:pPr>
-      <w:r>
-        <w:rPr>
-          <w:b/>
-          <w:bCs/>
-          <w:u w:val="single"/>
-        </w:rPr>
-        <w:t>Reviewer B</w:t>
-      </w:r>
-    </w:p>
-    <w:p>
-      <w:pPr>
-        <w:kinsoku w:val="0"/>
-        <w:overflowPunct w:val="0"/>
-        <w:spacing w:line="360" w:lineRule="auto"/>
-        <w:jc w:val="both"/>
-      </w:pPr>
-    </w:p>
-    <w:p>
-      <w:pPr>
-        <w:kinsoku w:val="0"/>
-        <w:overflowPunct w:val="0"/>
-        <w:spacing w:line="360" w:lineRule="auto"/>
-        <w:jc w:val="both"/>
-      </w:pPr>
-      <w:r>
-        <w:rPr>
-          <w:b/>
-          <w:bCs/>
-        </w:rPr>
-        <w:t>(B</w:t>
-      </w:r>
-      <w:r>
-        <w:rPr>
-          <w:b/>
-          <w:bCs/>
-        </w:rPr>
-        <w:t>.</w:t>
-      </w:r>
-      <w:r>
-        <w:rPr>
-          <w:b/>
-          <w:bCs/>
-        </w:rPr>
-        <w:t>1)</w:t>
-      </w:r>
-      <w:r>
-        <w:rPr>
-          <w:b/>
-          <w:bCs/>
-        </w:rPr>
-        <w:t xml:space="preserve"> Reviewer </w:t>
-      </w:r>
-      <w:r>
-        <w:rPr>
-          <w:b/>
-          <w:bCs/>
-        </w:rPr>
-        <w:t>B</w:t>
-      </w:r>
-      <w:proofErr w:type="gramStart"/>
-      <w:r>
-        <w:t>: ”</w:t>
-      </w:r>
-      <w:proofErr w:type="gramEnd"/>
-      <w:r>
-        <w:t>In a revision, however, the authors should address the</w:t>
-      </w:r>
-      <w:r>
-        <w:t xml:space="preserve"> </w:t>
-      </w:r>
-      <w:r>
-        <w:t>requirements for surface preparation and the need for crystalline</w:t>
-      </w:r>
-      <w:r>
-        <w:t xml:space="preserve"> </w:t>
-      </w:r>
-      <w:r>
-        <w:t>samples. It would also be interesting to know how much the intensity</w:t>
-      </w:r>
-      <w:r>
-        <w:t xml:space="preserve"> </w:t>
-      </w:r>
-      <w:r>
-        <w:t>decreases in the dark-field images shown</w:t>
-      </w:r>
-      <w:r>
-        <w:t>.”</w:t>
-      </w:r>
-    </w:p>
-    <w:p>
-      <w:pPr>
-        <w:kinsoku w:val="0"/>
-        <w:overflowPunct w:val="0"/>
-        <w:spacing w:line="360" w:lineRule="auto"/>
-        <w:jc w:val="both"/>
-      </w:pPr>
-    </w:p>
-    <w:p>
-      <w:pPr>
-        <w:kinsoku w:val="0"/>
-        <w:overflowPunct w:val="0"/>
-        <w:spacing w:line="360" w:lineRule="auto"/>
-        <w:jc w:val="both"/>
-      </w:pPr>
-      <w:r>
-        <w:rPr>
-          <w:b/>
-          <w:bCs/>
-        </w:rPr>
-        <w:t>Reply</w:t>
-      </w:r>
-      <w:r>
-        <w:t xml:space="preserve">: </w:t>
-      </w:r>
-      <w:r>
-        <w:t>The preparation of sample surfaces include</w:t>
-      </w:r>
-      <w:r>
-        <w:t>s</w:t>
-      </w:r>
-      <w:r>
-        <w:t xml:space="preserve"> standard surface science procedures in the ultrahigh vacuum chamber such as cleaning with noble gas ion sputtering</w:t>
-      </w:r>
-      <w:r>
-        <w:t xml:space="preserve"> and</w:t>
-      </w:r>
-      <w:r>
-        <w:t xml:space="preserve"> annealing in </w:t>
-      </w:r>
-      <w:r>
-        <w:t xml:space="preserve">ultrahigh </w:t>
-      </w:r>
-      <w:r>
-        <w:t>vacuum to recover the surface crystallinity</w:t>
-      </w:r>
-      <w:r>
-        <w:t>.</w:t>
-      </w:r>
-      <w:r>
-        <w:t xml:space="preserve"> </w:t>
-      </w:r>
-      <w:r>
-        <w:t xml:space="preserve">The surface quality </w:t>
-      </w:r>
-      <w:proofErr w:type="gramStart"/>
-      <w:r>
-        <w:t>has been confirmed</w:t>
-      </w:r>
-      <w:proofErr w:type="gramEnd"/>
-      <w:r>
-        <w:t xml:space="preserve"> by low-energy electron diffraction as well as Auger electron spectroscopy and x-ray photoelectron </w:t>
-      </w:r>
-      <w:r>
-        <w:lastRenderedPageBreak/>
-        <w:t xml:space="preserve">spectroscopy. The crystalline order of the surfaces </w:t>
+        <w:t xml:space="preserve"> by low-energy electron diffraction as well as Auger electron spectroscopy and x-ray photoelectron spectroscopy. The crystalline order of the surfaces </w:t>
       </w:r>
       <w:proofErr w:type="gramStart"/>
       <w:r>
@@ -4196,7 +4204,7 @@
             <w:noProof/>
             <w:lang w:val="de-DE"/>
           </w:rPr>
-          <w:t>4</w:t>
+          <w:t>8</w:t>
         </w:r>
         <w:r>
           <w:rPr>
@@ -5624,7 +5632,7 @@
 </file>
 
 <file path=customXml/itemProps1.xml><?xml version="1.0" encoding="utf-8"?>
-<ds:datastoreItem xmlns:ds="http://schemas.openxmlformats.org/officeDocument/2006/customXml" ds:itemID="{997AF109-9E63-4E46-9285-DE50F250CE5B}">
+<ds:datastoreItem xmlns:ds="http://schemas.openxmlformats.org/officeDocument/2006/customXml" ds:itemID="{138DF069-BD32-4F21-AA44-8C931ADB89FC}">
   <ds:schemaRefs>
     <ds:schemaRef ds:uri="http://schemas.openxmlformats.org/officeDocument/2006/bibliography"/>
   </ds:schemaRefs>

</xml_diff>